<commit_message>
Updated Changes in Research paper
</commit_message>
<xml_diff>
--- a/source/Team_Untitled_Files/Documentation/ML24-25_02_Investigate_Input_Reconstruction_by_using_Classifiers_Team_Untitled-Paper.docx
+++ b/source/Team_Untitled_Files/Documentation/ML24-25_02_Investigate_Input_Reconstruction_by_using_Classifiers_Team_Untitled-Paper.docx
@@ -2001,13 +2001,61 @@
         <w:rPr>
           <w:rFonts w:cstheme="minorBidi"/>
         </w:rPr>
-        <w:t xml:space="preserve"> dataset to ensure an unbiased distribution of data. The shuffled dataset is then split into two subsets: 80% for training and 20% for </w:t>
+        <w:t xml:space="preserve"> dataset</w:t>
       </w:r>
       <w:r>
         <w:rPr>
           <w:rFonts w:cstheme="minorBidi"/>
         </w:rPr>
-        <w:t>testing.</w:t>
+        <w:t xml:space="preserve"> (as shown in </w:t>
+      </w:r>
+      <w:r>
+        <w:rPr>
+          <w:rFonts w:cstheme="minorBidi"/>
+        </w:rPr>
+        <w:t>T</w:t>
+      </w:r>
+      <w:r>
+        <w:rPr>
+          <w:rFonts w:cstheme="minorBidi"/>
+        </w:rPr>
+        <w:t>able</w:t>
+      </w:r>
+      <w:r>
+        <w:rPr>
+          <w:rFonts w:cstheme="minorBidi"/>
+        </w:rPr>
+        <w:t xml:space="preserve"> </w:t>
+      </w:r>
+      <w:r>
+        <w:rPr>
+          <w:rFonts w:cstheme="minorBidi"/>
+        </w:rPr>
+        <w:t>1)</w:t>
+      </w:r>
+      <w:r>
+        <w:rPr>
+          <w:rFonts w:cstheme="minorBidi"/>
+        </w:rPr>
+        <w:t xml:space="preserve"> to ensure an unbiased distribution of data. The shuffled dataset is then split into two subsets: 80% for training and 20% for </w:t>
+      </w:r>
+      <w:r>
+        <w:rPr>
+          <w:rFonts w:cstheme="minorBidi"/>
+        </w:rPr>
+        <w:t>testing</w:t>
+      </w:r>
+      <w:r>
+        <w:rPr>
+          <w:rFonts w:cstheme="minorBidi"/>
+        </w:rPr>
+        <w:t xml:space="preserve"> as shown in Table 1</w:t>
+      </w:r>
+      <w:r>
+        <w:rPr>
+          <w:rFonts w:cstheme="minorBidi"/>
+        </w:rPr>
+        <w:t>.</w:t>
       </w:r>
     </w:p>
     <w:p>
@@ -2206,6 +2254,484 @@
       <w:pPr>
         <w:pStyle w:val="NoSpacing"/>
         <w:jc w:val="both"/>
+        <w:rPr>
+          <w:rFonts w:eastAsia="Times New Roman"/>
+        </w:rPr>
+      </w:pPr>
+    </w:p>
+    <w:tbl>
+      <w:tblPr>
+        <w:tblW w:w="4860" w:type="dxa"/>
+        <w:jc w:val="center"/>
+        <w:tblLayout w:type="fixed"/>
+        <w:tblLook w:val="06A0" w:firstRow="1" w:lastRow="0" w:firstColumn="1" w:lastColumn="0" w:noHBand="1" w:noVBand="1"/>
+      </w:tblPr>
+      <w:tblGrid>
+        <w:gridCol w:w="1308"/>
+        <w:gridCol w:w="1697"/>
+        <w:gridCol w:w="1855"/>
+      </w:tblGrid>
+      <w:tr>
+        <w:trPr>
+          <w:trHeight w:val="315"/>
+          <w:jc w:val="center"/>
+        </w:trPr>
+        <w:tc>
+          <w:tcPr>
+            <w:tcW w:w="1308" w:type="dxa"/>
+            <w:tcBorders>
+              <w:top w:val="single" w:sz="4" w:space="0" w:color="8EA9DB"/>
+              <w:left w:val="single" w:sz="4" w:space="0" w:color="000000" w:themeColor="text1"/>
+              <w:bottom w:val="single" w:sz="4" w:space="0" w:color="000000" w:themeColor="text1"/>
+              <w:right w:val="single" w:sz="4" w:space="0" w:color="000000" w:themeColor="text1"/>
+            </w:tcBorders>
+            <w:shd w:val="clear" w:color="auto" w:fill="4472C4" w:themeFill="accent1"/>
+            <w:tcMar>
+              <w:top w:w="15" w:type="dxa"/>
+              <w:left w:w="15" w:type="dxa"/>
+              <w:right w:w="15" w:type="dxa"/>
+            </w:tcMar>
+            <w:vAlign w:val="center"/>
+          </w:tcPr>
+          <w:p>
+            <w:r>
+              <w:rPr>
+                <w:rFonts w:ascii="Calibri" w:eastAsia="Calibri" w:hAnsi="Calibri" w:cs="Calibri"/>
+                <w:b/>
+                <w:bCs/>
+                <w:color w:val="FFFFFF" w:themeColor="background1"/>
+                <w:sz w:val="22"/>
+                <w:szCs w:val="22"/>
+              </w:rPr>
+              <w:t>Data</w:t>
+            </w:r>
+          </w:p>
+        </w:tc>
+        <w:tc>
+          <w:tcPr>
+            <w:tcW w:w="1697" w:type="dxa"/>
+            <w:tcBorders>
+              <w:top w:val="single" w:sz="4" w:space="0" w:color="8EA9DB"/>
+              <w:left w:val="single" w:sz="4" w:space="0" w:color="000000" w:themeColor="text1"/>
+              <w:bottom w:val="single" w:sz="4" w:space="0" w:color="000000" w:themeColor="text1"/>
+              <w:right w:val="single" w:sz="4" w:space="0" w:color="000000" w:themeColor="text1"/>
+            </w:tcBorders>
+            <w:shd w:val="clear" w:color="auto" w:fill="4472C4" w:themeFill="accent1"/>
+            <w:tcMar>
+              <w:top w:w="15" w:type="dxa"/>
+              <w:left w:w="15" w:type="dxa"/>
+              <w:right w:w="15" w:type="dxa"/>
+            </w:tcMar>
+            <w:vAlign w:val="center"/>
+          </w:tcPr>
+          <w:p>
+            <w:r>
+              <w:rPr>
+                <w:rFonts w:ascii="Calibri" w:eastAsia="Calibri" w:hAnsi="Calibri" w:cs="Calibri"/>
+                <w:b/>
+                <w:bCs/>
+                <w:color w:val="FFFFFF" w:themeColor="background1"/>
+                <w:sz w:val="22"/>
+                <w:szCs w:val="22"/>
+              </w:rPr>
+              <w:t xml:space="preserve">Case 1 </w:t>
+            </w:r>
+          </w:p>
+        </w:tc>
+        <w:tc>
+          <w:tcPr>
+            <w:tcW w:w="1855" w:type="dxa"/>
+            <w:tcBorders>
+              <w:top w:val="single" w:sz="4" w:space="0" w:color="8EA9DB"/>
+              <w:left w:val="single" w:sz="4" w:space="0" w:color="000000" w:themeColor="text1"/>
+              <w:bottom w:val="single" w:sz="4" w:space="0" w:color="000000" w:themeColor="text1"/>
+              <w:right w:val="single" w:sz="4" w:space="0" w:color="000000" w:themeColor="text1"/>
+            </w:tcBorders>
+            <w:shd w:val="clear" w:color="auto" w:fill="4472C4" w:themeFill="accent1"/>
+            <w:tcMar>
+              <w:top w:w="15" w:type="dxa"/>
+              <w:left w:w="15" w:type="dxa"/>
+              <w:right w:w="15" w:type="dxa"/>
+            </w:tcMar>
+            <w:vAlign w:val="center"/>
+          </w:tcPr>
+          <w:p>
+            <w:r>
+              <w:rPr>
+                <w:rFonts w:ascii="Calibri" w:eastAsia="Calibri" w:hAnsi="Calibri" w:cs="Calibri"/>
+                <w:b/>
+                <w:bCs/>
+                <w:color w:val="FFFFFF" w:themeColor="background1"/>
+                <w:sz w:val="22"/>
+                <w:szCs w:val="22"/>
+              </w:rPr>
+              <w:t xml:space="preserve">Case 2  </w:t>
+            </w:r>
+          </w:p>
+        </w:tc>
+      </w:tr>
+      <w:tr>
+        <w:trPr>
+          <w:trHeight w:val="315"/>
+          <w:jc w:val="center"/>
+        </w:trPr>
+        <w:tc>
+          <w:tcPr>
+            <w:tcW w:w="1308" w:type="dxa"/>
+            <w:tcBorders>
+              <w:top w:val="single" w:sz="4" w:space="0" w:color="000000" w:themeColor="text1"/>
+              <w:left w:val="single" w:sz="4" w:space="0" w:color="000000" w:themeColor="text1"/>
+              <w:bottom w:val="single" w:sz="4" w:space="0" w:color="000000" w:themeColor="text1"/>
+              <w:right w:val="single" w:sz="4" w:space="0" w:color="000000" w:themeColor="text1"/>
+            </w:tcBorders>
+            <w:shd w:val="clear" w:color="auto" w:fill="D9E1F2"/>
+            <w:tcMar>
+              <w:top w:w="15" w:type="dxa"/>
+              <w:left w:w="15" w:type="dxa"/>
+              <w:right w:w="15" w:type="dxa"/>
+            </w:tcMar>
+            <w:vAlign w:val="center"/>
+          </w:tcPr>
+          <w:p>
+            <w:pPr>
+              <w:pStyle w:val="NoSpacing"/>
+            </w:pPr>
+            <w:r>
+              <w:rPr>
+                <w:rFonts w:ascii="Calibri" w:eastAsia="Calibri" w:hAnsi="Calibri" w:cs="Calibri"/>
+                <w:color w:val="000000" w:themeColor="text1"/>
+                <w:sz w:val="22"/>
+                <w:szCs w:val="22"/>
+              </w:rPr>
+              <w:t xml:space="preserve">Input set </w:t>
+            </w:r>
+          </w:p>
+        </w:tc>
+        <w:tc>
+          <w:tcPr>
+            <w:tcW w:w="1697" w:type="dxa"/>
+            <w:tcBorders>
+              <w:top w:val="single" w:sz="4" w:space="0" w:color="000000" w:themeColor="text1"/>
+              <w:left w:val="single" w:sz="4" w:space="0" w:color="000000" w:themeColor="text1"/>
+              <w:bottom w:val="single" w:sz="4" w:space="0" w:color="000000" w:themeColor="text1"/>
+              <w:right w:val="single" w:sz="4" w:space="0" w:color="000000" w:themeColor="text1"/>
+            </w:tcBorders>
+            <w:shd w:val="clear" w:color="auto" w:fill="D9E1F2"/>
+            <w:tcMar>
+              <w:top w:w="15" w:type="dxa"/>
+              <w:left w:w="15" w:type="dxa"/>
+              <w:right w:w="15" w:type="dxa"/>
+            </w:tcMar>
+            <w:vAlign w:val="center"/>
+          </w:tcPr>
+          <w:p>
+            <w:r>
+              <w:rPr>
+                <w:rFonts w:ascii="Calibri" w:eastAsia="Calibri" w:hAnsi="Calibri" w:cs="Calibri"/>
+                <w:color w:val="000000" w:themeColor="text1"/>
+                <w:sz w:val="22"/>
+                <w:szCs w:val="22"/>
+              </w:rPr>
+              <w:t xml:space="preserve">1 - 20 </w:t>
+            </w:r>
+          </w:p>
+        </w:tc>
+        <w:tc>
+          <w:tcPr>
+            <w:tcW w:w="1855" w:type="dxa"/>
+            <w:tcBorders>
+              <w:top w:val="single" w:sz="4" w:space="0" w:color="000000" w:themeColor="text1"/>
+              <w:left w:val="single" w:sz="4" w:space="0" w:color="000000" w:themeColor="text1"/>
+              <w:bottom w:val="single" w:sz="4" w:space="0" w:color="000000" w:themeColor="text1"/>
+              <w:right w:val="single" w:sz="4" w:space="0" w:color="000000" w:themeColor="text1"/>
+            </w:tcBorders>
+            <w:shd w:val="clear" w:color="auto" w:fill="D9E1F2"/>
+            <w:tcMar>
+              <w:top w:w="15" w:type="dxa"/>
+              <w:left w:w="15" w:type="dxa"/>
+              <w:right w:w="15" w:type="dxa"/>
+            </w:tcMar>
+            <w:vAlign w:val="center"/>
+          </w:tcPr>
+          <w:p>
+            <w:r>
+              <w:rPr>
+                <w:rFonts w:ascii="Calibri" w:eastAsia="Calibri" w:hAnsi="Calibri" w:cs="Calibri"/>
+                <w:color w:val="000000" w:themeColor="text1"/>
+                <w:sz w:val="22"/>
+                <w:szCs w:val="22"/>
+              </w:rPr>
+              <w:t xml:space="preserve">1 - 50  </w:t>
+            </w:r>
+          </w:p>
+        </w:tc>
+      </w:tr>
+      <w:tr>
+        <w:trPr>
+          <w:trHeight w:val="645"/>
+          <w:jc w:val="center"/>
+        </w:trPr>
+        <w:tc>
+          <w:tcPr>
+            <w:tcW w:w="1308" w:type="dxa"/>
+            <w:tcBorders>
+              <w:top w:val="single" w:sz="4" w:space="0" w:color="000000" w:themeColor="text1"/>
+              <w:left w:val="single" w:sz="4" w:space="0" w:color="000000" w:themeColor="text1"/>
+              <w:bottom w:val="single" w:sz="4" w:space="0" w:color="000000" w:themeColor="text1"/>
+              <w:right w:val="single" w:sz="4" w:space="0" w:color="000000" w:themeColor="text1"/>
+            </w:tcBorders>
+            <w:tcMar>
+              <w:top w:w="15" w:type="dxa"/>
+              <w:left w:w="15" w:type="dxa"/>
+              <w:right w:w="15" w:type="dxa"/>
+            </w:tcMar>
+            <w:vAlign w:val="center"/>
+          </w:tcPr>
+          <w:p>
+            <w:pPr>
+              <w:pStyle w:val="NoSpacing"/>
+            </w:pPr>
+            <w:r>
+              <w:rPr>
+                <w:rFonts w:ascii="Calibri" w:eastAsia="Calibri" w:hAnsi="Calibri" w:cs="Calibri"/>
+                <w:color w:val="000000" w:themeColor="text1"/>
+                <w:sz w:val="22"/>
+                <w:szCs w:val="22"/>
+              </w:rPr>
+              <w:t xml:space="preserve">Training set (80%) </w:t>
+            </w:r>
+          </w:p>
+        </w:tc>
+        <w:tc>
+          <w:tcPr>
+            <w:tcW w:w="1697" w:type="dxa"/>
+            <w:tcBorders>
+              <w:top w:val="single" w:sz="4" w:space="0" w:color="000000" w:themeColor="text1"/>
+              <w:left w:val="single" w:sz="4" w:space="0" w:color="000000" w:themeColor="text1"/>
+              <w:bottom w:val="single" w:sz="4" w:space="0" w:color="000000" w:themeColor="text1"/>
+              <w:right w:val="single" w:sz="4" w:space="0" w:color="000000" w:themeColor="text1"/>
+            </w:tcBorders>
+            <w:tcMar>
+              <w:top w:w="15" w:type="dxa"/>
+              <w:left w:w="15" w:type="dxa"/>
+              <w:right w:w="15" w:type="dxa"/>
+            </w:tcMar>
+            <w:vAlign w:val="center"/>
+          </w:tcPr>
+          <w:p>
+            <w:r>
+              <w:rPr>
+                <w:rFonts w:ascii="Calibri" w:eastAsia="Calibri" w:hAnsi="Calibri" w:cs="Calibri"/>
+                <w:color w:val="000000" w:themeColor="text1"/>
+                <w:sz w:val="22"/>
+                <w:szCs w:val="22"/>
+              </w:rPr>
+              <w:t xml:space="preserve">1,3,13,17 </w:t>
+            </w:r>
+          </w:p>
+        </w:tc>
+        <w:tc>
+          <w:tcPr>
+            <w:tcW w:w="1855" w:type="dxa"/>
+            <w:tcBorders>
+              <w:top w:val="single" w:sz="4" w:space="0" w:color="000000" w:themeColor="text1"/>
+              <w:left w:val="single" w:sz="4" w:space="0" w:color="000000" w:themeColor="text1"/>
+              <w:bottom w:val="single" w:sz="4" w:space="0" w:color="000000" w:themeColor="text1"/>
+              <w:right w:val="single" w:sz="4" w:space="0" w:color="000000" w:themeColor="text1"/>
+            </w:tcBorders>
+            <w:tcMar>
+              <w:top w:w="15" w:type="dxa"/>
+              <w:left w:w="15" w:type="dxa"/>
+              <w:right w:w="15" w:type="dxa"/>
+            </w:tcMar>
+            <w:vAlign w:val="center"/>
+          </w:tcPr>
+          <w:p>
+            <w:r>
+              <w:rPr>
+                <w:rFonts w:ascii="Calibri" w:eastAsia="Calibri" w:hAnsi="Calibri" w:cs="Calibri"/>
+                <w:color w:val="000000" w:themeColor="text1"/>
+                <w:sz w:val="22"/>
+                <w:szCs w:val="22"/>
+              </w:rPr>
+              <w:t xml:space="preserve">1, 10, 17, 19, 20, 21, 27, 35, 38, 43  </w:t>
+            </w:r>
+          </w:p>
+        </w:tc>
+      </w:tr>
+      <w:tr>
+        <w:trPr>
+          <w:trHeight w:val="2235"/>
+          <w:jc w:val="center"/>
+        </w:trPr>
+        <w:tc>
+          <w:tcPr>
+            <w:tcW w:w="1308" w:type="dxa"/>
+            <w:tcBorders>
+              <w:top w:val="single" w:sz="4" w:space="0" w:color="000000" w:themeColor="text1"/>
+              <w:left w:val="single" w:sz="4" w:space="0" w:color="000000" w:themeColor="text1"/>
+              <w:bottom w:val="single" w:sz="4" w:space="0" w:color="000000" w:themeColor="text1"/>
+              <w:right w:val="single" w:sz="4" w:space="0" w:color="000000" w:themeColor="text1"/>
+            </w:tcBorders>
+            <w:shd w:val="clear" w:color="auto" w:fill="D9E1F2"/>
+            <w:tcMar>
+              <w:top w:w="15" w:type="dxa"/>
+              <w:left w:w="15" w:type="dxa"/>
+              <w:right w:w="15" w:type="dxa"/>
+            </w:tcMar>
+            <w:vAlign w:val="center"/>
+          </w:tcPr>
+          <w:p>
+            <w:pPr>
+              <w:pStyle w:val="NoSpacing"/>
+            </w:pPr>
+            <w:r>
+              <w:rPr>
+                <w:rFonts w:ascii="Calibri" w:eastAsia="Calibri" w:hAnsi="Calibri" w:cs="Calibri"/>
+                <w:color w:val="000000" w:themeColor="text1"/>
+                <w:sz w:val="22"/>
+                <w:szCs w:val="22"/>
+              </w:rPr>
+              <w:t>Testing set (20%)</w:t>
+            </w:r>
+          </w:p>
+        </w:tc>
+        <w:tc>
+          <w:tcPr>
+            <w:tcW w:w="1697" w:type="dxa"/>
+            <w:tcBorders>
+              <w:top w:val="single" w:sz="4" w:space="0" w:color="000000" w:themeColor="text1"/>
+              <w:left w:val="single" w:sz="4" w:space="0" w:color="000000" w:themeColor="text1"/>
+              <w:bottom w:val="single" w:sz="4" w:space="0" w:color="000000" w:themeColor="text1"/>
+              <w:right w:val="single" w:sz="4" w:space="0" w:color="000000" w:themeColor="text1"/>
+            </w:tcBorders>
+            <w:shd w:val="clear" w:color="auto" w:fill="D9E1F2"/>
+            <w:tcMar>
+              <w:top w:w="15" w:type="dxa"/>
+              <w:left w:w="15" w:type="dxa"/>
+              <w:right w:w="15" w:type="dxa"/>
+            </w:tcMar>
+            <w:vAlign w:val="center"/>
+          </w:tcPr>
+          <w:p>
+            <w:r>
+              <w:rPr>
+                <w:rFonts w:ascii="Calibri" w:eastAsia="Calibri" w:hAnsi="Calibri" w:cs="Calibri"/>
+                <w:color w:val="000000" w:themeColor="text1"/>
+                <w:sz w:val="22"/>
+                <w:szCs w:val="22"/>
+              </w:rPr>
+              <w:t xml:space="preserve">2, 4, 5, 6, 7, 8, 9, 10, 11, 12, 14, 15, 16, 18, 19, 20 </w:t>
+            </w:r>
+          </w:p>
+        </w:tc>
+        <w:tc>
+          <w:tcPr>
+            <w:tcW w:w="1855" w:type="dxa"/>
+            <w:tcBorders>
+              <w:top w:val="single" w:sz="4" w:space="0" w:color="000000" w:themeColor="text1"/>
+              <w:left w:val="single" w:sz="4" w:space="0" w:color="000000" w:themeColor="text1"/>
+              <w:bottom w:val="single" w:sz="4" w:space="0" w:color="000000" w:themeColor="text1"/>
+              <w:right w:val="single" w:sz="4" w:space="0" w:color="000000" w:themeColor="text1"/>
+            </w:tcBorders>
+            <w:shd w:val="clear" w:color="auto" w:fill="D9E1F2"/>
+            <w:tcMar>
+              <w:top w:w="15" w:type="dxa"/>
+              <w:left w:w="15" w:type="dxa"/>
+              <w:right w:w="15" w:type="dxa"/>
+            </w:tcMar>
+            <w:vAlign w:val="center"/>
+          </w:tcPr>
+          <w:p>
+            <w:r>
+              <w:rPr>
+                <w:rFonts w:ascii="Calibri" w:eastAsia="Calibri" w:hAnsi="Calibri" w:cs="Calibri"/>
+                <w:color w:val="000000" w:themeColor="text1"/>
+                <w:sz w:val="22"/>
+                <w:szCs w:val="22"/>
+              </w:rPr>
+              <w:t>2, 3, 4, 5, 6, 7, 8, 9, 11, 12, 13, 14, 15, 16, 18, 22, 23, 24, 25, 26, 28, 29, 30, 31, 32, 33, 34, 36, 37, 39, 40, 41, 42, 44, 45, 46, 47, 48, 49, 50</w:t>
+            </w:r>
+          </w:p>
+        </w:tc>
+      </w:tr>
+    </w:tbl>
+    <w:p>
+      <w:pPr>
+        <w:pStyle w:val="NoSpacing"/>
+        <w:jc w:val="both"/>
+        <w:rPr>
+          <w:rFonts w:eastAsia="Times New Roman"/>
+        </w:rPr>
+      </w:pPr>
+      <w:r>
+        <w:rPr>
+          <w:i/>
+          <w:iCs/>
+          <w:noProof/>
+          <w:lang w:val="en-IN"/>
+        </w:rPr>
+        <w:t>Table 1</w:t>
+      </w:r>
+      <w:r>
+        <w:rPr>
+          <w:i/>
+          <w:iCs/>
+          <w:noProof/>
+          <w:lang w:val="en-IN"/>
+        </w:rPr>
+        <w:t>:</w:t>
+      </w:r>
+      <w:r>
+        <w:rPr>
+          <w:i/>
+          <w:iCs/>
+          <w:noProof/>
+          <w:lang w:val="en-IN"/>
+        </w:rPr>
+        <w:t xml:space="preserve"> </w:t>
+      </w:r>
+      <w:r>
+        <w:rPr>
+          <w:i/>
+          <w:iCs/>
+          <w:noProof/>
+          <w:lang w:val="en-IN"/>
+        </w:rPr>
+        <w:t xml:space="preserve">Randomly Shuffled </w:t>
+      </w:r>
+      <w:r>
+        <w:rPr>
+          <w:i/>
+          <w:iCs/>
+          <w:noProof/>
+          <w:lang w:val="en-IN"/>
+        </w:rPr>
+        <w:t xml:space="preserve">Inputs </w:t>
+      </w:r>
+      <w:r>
+        <w:rPr>
+          <w:i/>
+          <w:iCs/>
+          <w:noProof/>
+          <w:lang w:val="en-IN"/>
+        </w:rPr>
+        <w:t>for</w:t>
+      </w:r>
+      <w:r>
+        <w:rPr>
+          <w:i/>
+          <w:iCs/>
+          <w:noProof/>
+          <w:lang w:val="en-IN"/>
+        </w:rPr>
+        <w:t xml:space="preserve"> Case 1 and Case 2.</w:t>
+      </w:r>
+    </w:p>
+    <w:p>
+      <w:pPr>
+        <w:pStyle w:val="NoSpacing"/>
+        <w:jc w:val="both"/>
       </w:pPr>
     </w:p>
     <w:p>
@@ -2221,9 +2747,9 @@
           <w:noProof/>
         </w:rPr>
         <w:drawing>
-          <wp:inline distT="0" distB="0" distL="0" distR="0" wp14:anchorId="77BE54DF" wp14:editId="23552A21">
-            <wp:extent cx="2486891" cy="6367344"/>
-            <wp:effectExtent l="0" t="0" r="8890" b="0"/>
+          <wp:inline distT="0" distB="0" distL="0" distR="0" wp14:anchorId="77BE54DF" wp14:editId="6CA01A22">
+            <wp:extent cx="2604123" cy="6667500"/>
+            <wp:effectExtent l="0" t="0" r="6350" b="0"/>
             <wp:docPr id="186892232" name="Picture 2"/>
             <wp:cNvGraphicFramePr>
               <a:graphicFrameLocks xmlns:a="http://schemas.openxmlformats.org/drawingml/2006/main" noChangeAspect="1"/>
@@ -2250,7 +2776,7 @@
                   <pic:spPr>
                     <a:xfrm>
                       <a:off x="0" y="0"/>
-                      <a:ext cx="2520679" cy="6453854"/>
+                      <a:ext cx="2646074" cy="6774910"/>
                     </a:xfrm>
                     <a:prstGeom prst="rect">
                       <a:avLst/>
@@ -2271,41 +2797,50 @@
           <w:iCs/>
         </w:rPr>
       </w:pPr>
-      <w:r>
-        <w:rPr>
+    </w:p>
+    <w:p>
+      <w:pPr>
+        <w:rPr>
+          <w:rFonts w:eastAsia="Times New Roman"/>
           <w:i/>
           <w:iCs/>
         </w:rPr>
-        <w:t>Fig</w:t>
-      </w:r>
+      </w:pPr>
       <w:r>
         <w:rPr>
           <w:i/>
           <w:iCs/>
         </w:rPr>
-        <w:t>.</w:t>
+        <w:t>Fig</w:t>
       </w:r>
       <w:r>
         <w:rPr>
           <w:i/>
           <w:iCs/>
         </w:rPr>
-        <w:t xml:space="preserve"> 3: Workflow of the reconstruction </w:t>
+        <w:t>.</w:t>
       </w:r>
       <w:r>
         <w:rPr>
           <w:i/>
           <w:iCs/>
         </w:rPr>
-        <w:t>process</w:t>
-      </w:r>
-    </w:p>
-    <w:p>
-      <w:pPr>
+        <w:t xml:space="preserve"> 3: Workflow of the reconstruction </w:t>
+      </w:r>
+      <w:r>
         <w:rPr>
           <w:i/>
           <w:iCs/>
         </w:rPr>
+        <w:t>process</w:t>
+      </w:r>
+    </w:p>
+    <w:p>
+      <w:pPr>
+        <w:rPr>
+          <w:i/>
+          <w:iCs/>
+        </w:rPr>
       </w:pPr>
     </w:p>
     <w:p>
@@ -2322,6 +2857,7 @@
           <w:b/>
           <w:bCs/>
         </w:rPr>
+        <w:lastRenderedPageBreak/>
         <w:t>Similarity Comparison and Evaluation:</w:t>
       </w:r>
     </w:p>
@@ -2360,7 +2896,7 @@
     <w:p/>
     <w:p>
       <w:pPr>
-        <w:spacing w:after="160"/>
+        <w:spacing w:after="160" w:line="259" w:lineRule="auto"/>
         <w:jc w:val="both"/>
       </w:pPr>
       <w:r>
@@ -2373,11 +2909,25 @@
         <w:t xml:space="preserve">the classifiers. We are just referencing it as “Internal Similarity”. </w:t>
       </w:r>
       <w:r>
-        <w:t xml:space="preserve">The internal similarity metric plays a crucial role in evaluating the performance of the classifiers by measuring the alignment between the predicted values generated by the classifier and the encoded Sparse Distributed Representations (SDRs). This metric assesses whether the classifier maintains </w:t>
-      </w:r>
-      <w:r>
-        <w:lastRenderedPageBreak/>
-        <w:t>consistency with the patterns it has learned during the training phase. By comparing the predicted outputs to the encoded SDRs, internal similarity provides insight into how well the classifier generalizes from the training data and whether it can accurately reconstruct input values. This evaluation is essential for ensuring the reliability and effectiveness of the classifiers in tasks such as input reconstruction, anomaly detection, and predictive modeling.</w:t>
+        <w:t xml:space="preserve">The internal similarity metric plays a crucial role in evaluating the performance of the classifiers by </w:t>
+      </w:r>
+      <w:r>
+        <w:t xml:space="preserve">comparing </w:t>
+      </w:r>
+      <w:r>
+        <w:t xml:space="preserve">the </w:t>
+      </w:r>
+      <w:r>
+        <w:t>SDRs of the</w:t>
+      </w:r>
+      <w:r>
+        <w:t xml:space="preserve"> predicted values generated by the classifier and the encoded Sparse Distributed Representations (SDRs)</w:t>
+      </w:r>
+      <w:r>
+        <w:t xml:space="preserve"> of the input</w:t>
+      </w:r>
+      <w:r>
+        <w:t>. This metric assesses whether the classifier maintains consistency with the patterns it has learned during the training phase. By comparing SDRs, internal similarity provides insight into how well the classifier generalizes from the training data and whether it can accurately reconstruct input values. This evaluation is essential for ensuring the reliability and effectiveness of the classifiers in tasks such as input reconstruction, anomaly detection, and predictive modeling.</w:t>
       </w:r>
     </w:p>
     <w:p>
@@ -2641,7 +3191,10 @@
       </w:r>
       <w:proofErr w:type="spellEnd"/>
       <w:r>
-        <w:t xml:space="preserve"> in .NET, providing a clear and intuitive comparison between the original input values and the reconstructed outputs. These visualizations are divided into two categories: training data visualizations, which represent the reconstruction accuracy of the classifiers on the 80% training dataset, and test data visualizations, which demonstrate how well the classifiers generalize to the 20% unseen test data. By plotting these results, the visualizations help identify trends and accuracy levels across the HTM Classifier and KNN Classifier, enabling a detailed analysis of their performance. Through the analysis of similarity metrics, such as internal similarity and percentage similarity, we determine which classifier is more effective for input reconstruction using Sparse Distributed Representations (SDRs). These visualizations and metrics collectively provide valuable insights into the strengths and limitations of each classifier, guiding the evaluation of their suitability for</w:t>
+        <w:t xml:space="preserve"> in .NET, providing a clear and intuitive </w:t>
+      </w:r>
+      <w:r>
+        <w:t>comparison between the original input values and the reconstructed outputs. These visualizations are divided into two categories: training data visualizations, which represent the reconstruction accuracy of the classifiers on the 80% training dataset, and test data visualizations, which demonstrate how well the classifiers generalize to the 20% unseen test data. By plotting these results, the visualizations help identify trends and accuracy levels across the HTM Classifier and KNN Classifier, enabling a detailed analysis of their performance. Through the analysis of similarity metrics, such as internal similarity and percentage similarity, we determine which classifier is more effective for input reconstruction using Sparse Distributed Representations (SDRs). These visualizations and metrics collectively provide valuable insights into the strengths and limitations of each classifier, guiding the evaluation of their suitability for</w:t>
       </w:r>
       <w:r>
         <w:t xml:space="preserve"> </w:t>
@@ -3050,6 +3603,7 @@
           <w:b/>
           <w:bCs/>
         </w:rPr>
+        <w:lastRenderedPageBreak/>
         <w:t>Development Environment</w:t>
       </w:r>
     </w:p>
@@ -3181,7 +3735,6 @@
       </w:pPr>
       <w:proofErr w:type="spellStart"/>
       <w:r>
-        <w:lastRenderedPageBreak/>
         <w:t>System.Linq</w:t>
       </w:r>
       <w:proofErr w:type="spellEnd"/>
@@ -3491,16 +4044,30 @@
         <w:jc w:val="both"/>
       </w:pPr>
       <w:r>
-        <w:t>The SpatialPoolerInputReconstructionExperiment class is the core of the experiment. It orchestrates the entire process of input reconstruction using Sparse Distributed Representations (SDRs), Hierarchical Temporal Memory (HTM), and K-Nearest Neighbors (KNN) classifiers. The class initializes the necessary components, such as the Spatial Pooler (SP) and Scalar Encoder, and manages the training and evaluation of the classifiers. It also handles the visualization of results using the </w:t>
+        <w:t>The </w:t>
       </w:r>
       <w:proofErr w:type="spellStart"/>
       <w:r>
+        <w:t>SpatialPoolerInputReconstructionExperiment</w:t>
+      </w:r>
+      <w:proofErr w:type="spellEnd"/>
+      <w:r>
+        <w:t> class is the core of the experiment. It orchestrates the entire process of input reconstruction using Sparse Distributed Representations (SDRs), Hierarchical Temporal Memory (HTM), and K-Nearest Neighbors (KNN) classifiers. The class initializes the necessary components, such as the Spatial Pooler (SP) and Scalar Encoder, and manages the training and evaluation of the classifiers. It also handles the visualization of results using the </w:t>
+      </w:r>
+      <w:proofErr w:type="spellStart"/>
+      <w:r>
         <w:t>ScottPlot</w:t>
       </w:r>
       <w:proofErr w:type="spellEnd"/>
       <w:r>
         <w:t> library. The class is designed to be modular, with each method performing a specific task, such as training the SP, training the classifiers, reconstructing inputs, and plotting results. This modular structure makes the code easy to understand, extend, and maintain.</w:t>
       </w:r>
+    </w:p>
+    <w:p>
+      <w:pPr>
+        <w:spacing w:after="160"/>
+        <w:jc w:val="both"/>
+      </w:pPr>
     </w:p>
     <w:p>
       <w:pPr>
@@ -3528,35 +4095,10 @@
       <w:r>
         <w:t>The </w:t>
       </w:r>
-      <w:proofErr w:type="gramStart"/>
-      <w:r>
-        <w:t>ReconstructionExperiment</w:t>
-      </w:r>
-      <w:r>
-        <w:t>(</w:t>
-      </w:r>
-      <w:proofErr w:type="gramEnd"/>
-      <w:r>
-        <w:t xml:space="preserve">) </w:t>
-      </w:r>
-      <w:r>
-        <w:t>method</w:t>
-      </w:r>
-      <w:r>
-        <w:t xml:space="preserve"> is the entry point of the experiment. It initializes the Spatial Pooler (SP) and Scalar Encoder with predefined parameters. The max parameter defines the range of input values, from 1 to max, while the </w:t>
-      </w:r>
-      <w:proofErr w:type="spellStart"/>
-      <w:r>
-        <w:t>seedValue</w:t>
-      </w:r>
-      <w:proofErr w:type="spellEnd"/>
-      <w:r>
-        <w:t> ensures reproducibility by controlling the random shuffling of the dataset. The method first trains the SP using the </w:t>
-      </w:r>
       <w:proofErr w:type="spellStart"/>
       <w:proofErr w:type="gramStart"/>
       <w:r>
-        <w:t>TrainSpatialPooler</w:t>
+        <w:t>ReconstructionExperiment</w:t>
       </w:r>
       <w:proofErr w:type="spellEnd"/>
       <w:r>
@@ -3564,11 +4106,38 @@
       </w:r>
       <w:proofErr w:type="gramEnd"/>
       <w:r>
-        <w:t>) method, which generates stable SDR representations of the input data. After training the SP, the method calls </w:t>
+        <w:t xml:space="preserve">) </w:t>
+      </w:r>
+      <w:r>
+        <w:t>method</w:t>
+      </w:r>
+      <w:r>
+        <w:t xml:space="preserve"> is the entry point of the experiment. It initializes the Spatial Pooler (SP) and Scalar Encoder with predefined parameters. The max parameter defines the range of input values, from 1 to max, while the </w:t>
+      </w:r>
+      <w:proofErr w:type="spellStart"/>
+      <w:r>
+        <w:t>seedValue</w:t>
+      </w:r>
+      <w:proofErr w:type="spellEnd"/>
+      <w:r>
+        <w:t> ensures reproducibility by controlling the random shuffling of the dataset. The method first trains the SP using the </w:t>
       </w:r>
       <w:proofErr w:type="spellStart"/>
       <w:proofErr w:type="gramStart"/>
       <w:r>
+        <w:t>TrainSpatialPooler</w:t>
+      </w:r>
+      <w:proofErr w:type="spellEnd"/>
+      <w:r>
+        <w:t>(</w:t>
+      </w:r>
+      <w:proofErr w:type="gramEnd"/>
+      <w:r>
+        <w:t>) method, which generates stable SDR representations of the input data. After training the SP, the method calls </w:t>
+      </w:r>
+      <w:proofErr w:type="spellStart"/>
+      <w:proofErr w:type="gramStart"/>
+      <w:r>
         <w:t>CompareClassifiers</w:t>
       </w:r>
       <w:proofErr w:type="spellEnd"/>
@@ -3588,18 +4157,6 @@
       <w:r>
         <w:t>.</w:t>
       </w:r>
-    </w:p>
-    <w:p>
-      <w:pPr>
-        <w:spacing w:after="160"/>
-        <w:jc w:val="both"/>
-      </w:pPr>
-    </w:p>
-    <w:p>
-      <w:pPr>
-        <w:spacing w:after="160"/>
-        <w:jc w:val="both"/>
-      </w:pPr>
     </w:p>
     <w:p>
       <w:pPr>
@@ -3913,7 +4470,11 @@
         <w:t xml:space="preserve"> </w:t>
       </w:r>
       <w:r>
-        <w:t>This method is used to evaluate the accuracy of the reconstructed values compared to the original input values. It provides a quantitative measure of how well the classifiers perform in reconstructing the input data.</w:t>
+        <w:t xml:space="preserve">This method is used to evaluate </w:t>
+      </w:r>
+      <w:r>
+        <w:lastRenderedPageBreak/>
+        <w:t>the accuracy of the reconstructed values compared to the original input values. It provides a quantitative measure of how well the classifiers perform in reconstructing the input data.</w:t>
       </w:r>
     </w:p>
     <w:p>
@@ -4018,7 +4579,6 @@
         <w:jc w:val="both"/>
       </w:pPr>
       <w:r>
-        <w:lastRenderedPageBreak/>
         <w:t>The </w:t>
       </w:r>
       <w:proofErr w:type="spellStart"/>
@@ -4182,7 +4742,21 @@
         <w:rPr>
           <w:rFonts w:cstheme="minorBidi"/>
         </w:rPr>
-        <w:t>Unit testing is a critical component of software development, ensuring that individual components of the system function as expected. In this study, unit tests were developed to validate the functionality of the SpatialPoolerInputReconstructionExperiment class,</w:t>
+        <w:t>Unit testing is a critical component of software development, ensuring that individual components of the system function as expected. In this study, unit tests were developed to validate the functionality of the </w:t>
+      </w:r>
+      <w:proofErr w:type="spellStart"/>
+      <w:r>
+        <w:rPr>
+          <w:rFonts w:cstheme="minorBidi"/>
+        </w:rPr>
+        <w:t>SpatialPoolerInputReconstructionExperiment</w:t>
+      </w:r>
+      <w:proofErr w:type="spellEnd"/>
+      <w:r>
+        <w:rPr>
+          <w:rFonts w:cstheme="minorBidi"/>
+        </w:rPr>
+        <w:t> class,</w:t>
       </w:r>
       <w:r>
         <w:rPr>
@@ -4302,36 +4876,6 @@
     </w:p>
     <w:p>
       <w:pPr>
-        <w:jc w:val="both"/>
-        <w:rPr>
-          <w:spacing w:val="-1"/>
-          <w:sz w:val="16"/>
-          <w:szCs w:val="16"/>
-        </w:rPr>
-      </w:pPr>
-    </w:p>
-    <w:p>
-      <w:pPr>
-        <w:jc w:val="both"/>
-        <w:rPr>
-          <w:spacing w:val="-1"/>
-          <w:sz w:val="16"/>
-          <w:szCs w:val="16"/>
-        </w:rPr>
-      </w:pPr>
-    </w:p>
-    <w:p>
-      <w:pPr>
-        <w:jc w:val="both"/>
-        <w:rPr>
-          <w:spacing w:val="-1"/>
-          <w:sz w:val="16"/>
-          <w:szCs w:val="16"/>
-        </w:rPr>
-      </w:pPr>
-    </w:p>
-    <w:p>
-      <w:pPr>
         <w:pStyle w:val="Heading2"/>
         <w:rPr>
           <w:b/>
@@ -4352,7 +4896,15 @@
         <w:jc w:val="both"/>
       </w:pPr>
       <w:r>
-        <w:t>The unit tests were implemented in the SpatialPoolerInputReconstructionExperimentTests class, which contains five test methods:</w:t>
+        <w:t>The unit tests were implemented in the </w:t>
+      </w:r>
+      <w:proofErr w:type="spellStart"/>
+      <w:r>
+        <w:t>SpatialPoolerInputReconstructionExperimentTests</w:t>
+      </w:r>
+      <w:proofErr w:type="spellEnd"/>
+      <w:r>
+        <w:t> class, which contains five test methods:</w:t>
       </w:r>
     </w:p>
     <w:p>
@@ -4413,7 +4965,25 @@
           <w:sz w:val="20"/>
           <w:szCs w:val="20"/>
         </w:rPr>
-        <w:t>To validate that the ReconstructionExperiment method executes without runtime errors, ensuring basic code stability and workflow integrity. This smoke test confirms that the experiment setup, SP/classifier initialization, and data processing pipelines function without fatal crashes or unhandled exceptions. </w:t>
+        <w:t xml:space="preserve">To validate that the </w:t>
+      </w:r>
+      <w:proofErr w:type="spellStart"/>
+      <w:r>
+        <w:rPr>
+          <w:rFonts w:ascii="Times New Roman" w:hAnsi="Times New Roman"/>
+          <w:sz w:val="20"/>
+          <w:szCs w:val="20"/>
+        </w:rPr>
+        <w:t>ReconstructionExperiment</w:t>
+      </w:r>
+      <w:proofErr w:type="spellEnd"/>
+      <w:r>
+        <w:rPr>
+          <w:rFonts w:ascii="Times New Roman" w:hAnsi="Times New Roman"/>
+          <w:sz w:val="20"/>
+          <w:szCs w:val="20"/>
+        </w:rPr>
+        <w:t xml:space="preserve"> method executes without runtime errors, ensuring basic code stability and workflow integrity. This smoke test confirms that the experiment setup, SP/classifier initialization, and data processing pipelines function without fatal crashes or unhandled exceptions. </w:t>
       </w:r>
     </w:p>
     <w:p>
@@ -4632,7 +5202,34 @@
           <w:sz w:val="20"/>
           <w:szCs w:val="20"/>
         </w:rPr>
-        <w:t>To verify that the experiment gracefully handles invalid input by throwing an ArgumentException when an improper max value (e.g., 8) is provided. This ensures robust error handling and input validation mechanisms are in place. From our observation we have seen that experiment performs well when the value of max is greater than 10.</w:t>
+        <w:t xml:space="preserve">To verify that the experiment gracefully handles invalid input by throwing an </w:t>
+      </w:r>
+      <w:proofErr w:type="spellStart"/>
+      <w:r>
+        <w:rPr>
+          <w:rFonts w:ascii="Times New Roman" w:hAnsi="Times New Roman"/>
+          <w:sz w:val="20"/>
+          <w:szCs w:val="20"/>
+        </w:rPr>
+        <w:t>ArgumentException</w:t>
+      </w:r>
+      <w:proofErr w:type="spellEnd"/>
+      <w:r>
+        <w:rPr>
+          <w:rFonts w:ascii="Times New Roman" w:hAnsi="Times New Roman"/>
+          <w:sz w:val="20"/>
+          <w:szCs w:val="20"/>
+        </w:rPr>
+        <w:t xml:space="preserve"> when an improper max value (e.g., 8) is provided. This ensures robust error handling and input </w:t>
+      </w:r>
+      <w:r>
+        <w:rPr>
+          <w:rFonts w:ascii="Times New Roman" w:hAnsi="Times New Roman"/>
+          <w:sz w:val="20"/>
+          <w:szCs w:val="20"/>
+        </w:rPr>
+        <w:lastRenderedPageBreak/>
+        <w:t>validation mechanisms are in place. From our observation we have seen that experiment performs well when the value of max is greater than 10.</w:t>
       </w:r>
       <w:r>
         <w:rPr>
@@ -4682,6 +5279,7 @@
         </w:rPr>
         <w:t xml:space="preserve">The test invokes </w:t>
       </w:r>
+      <w:proofErr w:type="spellStart"/>
       <w:proofErr w:type="gramStart"/>
       <w:r>
         <w:rPr>
@@ -4689,16 +5287,43 @@
           <w:sz w:val="20"/>
           <w:szCs w:val="20"/>
         </w:rPr>
-        <w:t>ReconstructionExperiment(</w:t>
-      </w:r>
-      <w:proofErr w:type="gramEnd"/>
+        <w:t>ReconstructionExperiment</w:t>
+      </w:r>
+      <w:proofErr w:type="spellEnd"/>
       <w:r>
         <w:rPr>
           <w:rFonts w:ascii="Times New Roman" w:hAnsi="Times New Roman"/>
           <w:sz w:val="20"/>
           <w:szCs w:val="20"/>
         </w:rPr>
-        <w:t>8), which violates the method’s requirement for max to be a minimum of 10. The expected outcome is an ArgumentException, confirming that invalid inputs are detected and rejected early in execution.</w:t>
+        <w:t>(</w:t>
+      </w:r>
+      <w:proofErr w:type="gramEnd"/>
+      <w:r>
+        <w:rPr>
+          <w:rFonts w:ascii="Times New Roman" w:hAnsi="Times New Roman"/>
+          <w:sz w:val="20"/>
+          <w:szCs w:val="20"/>
+        </w:rPr>
+        <w:t xml:space="preserve">8), which violates the method’s requirement for max to be a minimum of 10. The expected outcome is an </w:t>
+      </w:r>
+      <w:proofErr w:type="spellStart"/>
+      <w:r>
+        <w:rPr>
+          <w:rFonts w:ascii="Times New Roman" w:hAnsi="Times New Roman"/>
+          <w:sz w:val="20"/>
+          <w:szCs w:val="20"/>
+        </w:rPr>
+        <w:t>ArgumentException</w:t>
+      </w:r>
+      <w:proofErr w:type="spellEnd"/>
+      <w:r>
+        <w:rPr>
+          <w:rFonts w:ascii="Times New Roman" w:hAnsi="Times New Roman"/>
+          <w:sz w:val="20"/>
+          <w:szCs w:val="20"/>
+        </w:rPr>
+        <w:t>, confirming that invalid inputs are detected and rejected early in execution.</w:t>
       </w:r>
       <w:r>
         <w:rPr>
@@ -4746,7 +5371,7 @@
           <w:sz w:val="20"/>
           <w:szCs w:val="20"/>
         </w:rPr>
-        <w:t xml:space="preserve">The test passes if the method throws an ArgumentException, as enforced by the </w:t>
+        <w:t xml:space="preserve">The test passes if the method throws an </w:t>
       </w:r>
       <w:proofErr w:type="spellStart"/>
       <w:r>
@@ -4755,7 +5380,7 @@
           <w:sz w:val="20"/>
           <w:szCs w:val="20"/>
         </w:rPr>
-        <w:t>ExpectedException</w:t>
+        <w:t>ArgumentException</w:t>
       </w:r>
       <w:proofErr w:type="spellEnd"/>
       <w:r>
@@ -4764,16 +5389,25 @@
           <w:sz w:val="20"/>
           <w:szCs w:val="20"/>
         </w:rPr>
-        <w:t xml:space="preserve"> attribute. This demonstrates </w:t>
-      </w:r>
+        <w:t xml:space="preserve">, as enforced by the </w:t>
+      </w:r>
+      <w:proofErr w:type="spellStart"/>
       <w:r>
         <w:rPr>
           <w:rFonts w:ascii="Times New Roman" w:hAnsi="Times New Roman"/>
           <w:sz w:val="20"/>
           <w:szCs w:val="20"/>
         </w:rPr>
-        <w:lastRenderedPageBreak/>
-        <w:t>proper input validation and prevents silent failures due to invalid parameters.</w:t>
+        <w:t>ExpectedException</w:t>
+      </w:r>
+      <w:proofErr w:type="spellEnd"/>
+      <w:r>
+        <w:rPr>
+          <w:rFonts w:ascii="Times New Roman" w:hAnsi="Times New Roman"/>
+          <w:sz w:val="20"/>
+          <w:szCs w:val="20"/>
+        </w:rPr>
+        <w:t xml:space="preserve"> attribute. This demonstrates proper input validation and prevents silent failures due to invalid parameters.</w:t>
       </w:r>
       <w:r>
         <w:rPr>
@@ -5128,7 +5762,15 @@
           <w:sz w:val="20"/>
           <w:szCs w:val="20"/>
         </w:rPr>
-        <w:t>After running the experiment, the console output is analyzed for strings like "KNN - Reconstructed Input" and "HTM - Reconstructed Input". The presence of these strings confirms that both classifiers are active and generating predictions.</w:t>
+        <w:t xml:space="preserve">After running the experiment, the console output is analyzed for strings like "KNN - Reconstructed Input" and "HTM - Reconstructed Input". The </w:t>
+      </w:r>
+      <w:r>
+        <w:rPr>
+          <w:rFonts w:ascii="Times New Roman" w:hAnsi="Times New Roman"/>
+          <w:sz w:val="20"/>
+          <w:szCs w:val="20"/>
+        </w:rPr>
+        <w:t>presence of these strings confirms that both classifiers are active and generating predictions.</w:t>
       </w:r>
       <w:r>
         <w:rPr>
@@ -5225,15 +5867,7 @@
           <w:sz w:val="20"/>
           <w:szCs w:val="20"/>
         </w:rPr>
-        <w:t xml:space="preserve">Ensures the experiment’s core functionality—input reconstruction—is operational. By validating both classifiers, it confirms the system’s ability to </w:t>
-      </w:r>
-      <w:r>
-        <w:rPr>
-          <w:rFonts w:ascii="Times New Roman" w:hAnsi="Times New Roman"/>
-          <w:sz w:val="20"/>
-          <w:szCs w:val="20"/>
-        </w:rPr>
-        <w:t>compare different approaches, aiding in model selection and tuning.</w:t>
+        <w:t>Ensures the experiment’s core functionality—input reconstruction—is operational. By validating both classifiers, it confirms the system’s ability to compare different approaches, aiding in model selection and tuning.</w:t>
       </w:r>
       <w:r>
         <w:rPr>
@@ -5482,7 +6116,15 @@
         <w:jc w:val="both"/>
       </w:pPr>
       <w:r>
-        <w:t>Experiment Completes Without Errors: The RunExperiment method executed without throwing any exceptions, indicating that the experiment's core functionality is stable.</w:t>
+        <w:t>Experiment Completes Without Errors: The </w:t>
+      </w:r>
+      <w:proofErr w:type="spellStart"/>
+      <w:r>
+        <w:t>RunExperiment</w:t>
+      </w:r>
+      <w:proofErr w:type="spellEnd"/>
+      <w:r>
+        <w:t> method executed without throwing any exceptions, indicating that the experiment's core functionality is stable.</w:t>
       </w:r>
     </w:p>
     <w:p>
@@ -5513,6 +6155,13 @@
     </w:p>
     <w:p>
       <w:pPr>
+        <w:spacing w:after="160"/>
+        <w:ind w:left="720"/>
+        <w:jc w:val="both"/>
+      </w:pPr>
+    </w:p>
+    <w:p>
+      <w:pPr>
         <w:pStyle w:val="Heading2"/>
         <w:rPr>
           <w:b/>
@@ -5524,6 +6173,7 @@
           <w:b/>
           <w:bCs/>
         </w:rPr>
+        <w:lastRenderedPageBreak/>
         <w:t>Importance of Unit Testing</w:t>
       </w:r>
     </w:p>
@@ -5569,11 +6219,7 @@
         <w:jc w:val="both"/>
       </w:pPr>
       <w:r>
-        <w:t xml:space="preserve">Validate Functionality: The tests confirmed that the experiment's key components (encoding, Spatial </w:t>
-      </w:r>
-      <w:r>
-        <w:lastRenderedPageBreak/>
-        <w:t>Pooler training, and reconstruction) functioned as expected.</w:t>
+        <w:t>Validate Functionality: The tests confirmed that the experiment's key components (encoding, Spatial Pooler training, and reconstruction) functioned as expected.</w:t>
       </w:r>
     </w:p>
     <w:p>
@@ -5875,19 +6521,8 @@
         <w:t>of the reconstructed input with the original input.</w:t>
       </w:r>
       <w:r>
-        <w:t xml:space="preserve"> Also, the similarity of KNN is in blue and HTM is in red. So, </w:t>
-      </w:r>
-      <w:r>
-        <w:t>if a red line is taller that means HTM performed better than KNN and vice versa.</w:t>
-      </w:r>
-    </w:p>
-    <w:p>
-      <w:pPr>
-        <w:jc w:val="both"/>
-        <w:rPr>
-          <w:lang w:val="en-IN"/>
-        </w:rPr>
-      </w:pPr>
+        <w:t xml:space="preserve"> Also, the similarity of KNN is in blue and HTM is in red. So, if a red line is taller that means HTM performed better than KNN and vice versa.</w:t>
+      </w:r>
     </w:p>
     <w:p>
       <w:pPr>
@@ -5933,63 +6568,119 @@
           <w:noProof/>
           <w:lang w:val="en-IN"/>
         </w:rPr>
-        <w:t xml:space="preserve">Table 1 shows how the KNN classifier performed the reconstruction. Fig. 4 represents the KNN plots from the </w:t>
+        <w:t xml:space="preserve">Table </w:t>
       </w:r>
       <w:r>
         <w:rPr>
           <w:noProof/>
           <w:lang w:val="en-IN"/>
         </w:rPr>
-        <w:t>T</w:t>
+        <w:t>2</w:t>
       </w:r>
       <w:r>
         <w:rPr>
           <w:noProof/>
           <w:lang w:val="en-IN"/>
         </w:rPr>
-        <w:t>able</w:t>
+        <w:t xml:space="preserve"> shows how the KNN classifier performed the reconstruction. Fig. 4 represents the KNN plots from the </w:t>
       </w:r>
       <w:r>
         <w:rPr>
           <w:noProof/>
           <w:lang w:val="en-IN"/>
         </w:rPr>
-        <w:t xml:space="preserve"> 1. In contrast, Table 2 shows how the HTM classifier performed the reco</w:t>
+        <w:t>T</w:t>
       </w:r>
       <w:r>
         <w:rPr>
           <w:noProof/>
           <w:lang w:val="en-IN"/>
         </w:rPr>
-        <w:t>nstr</w:t>
+        <w:t>able</w:t>
       </w:r>
       <w:r>
         <w:rPr>
           <w:noProof/>
           <w:lang w:val="en-IN"/>
         </w:rPr>
-        <w:t xml:space="preserve">uction. Fig. 5 represents the HTM plots from the </w:t>
+        <w:t xml:space="preserve"> </w:t>
       </w:r>
       <w:r>
         <w:rPr>
           <w:noProof/>
           <w:lang w:val="en-IN"/>
         </w:rPr>
-        <w:t>T</w:t>
+        <w:t>2</w:t>
       </w:r>
       <w:r>
         <w:rPr>
           <w:noProof/>
           <w:lang w:val="en-IN"/>
         </w:rPr>
-        <w:t>able</w:t>
+        <w:t xml:space="preserve">. In contrast, Table </w:t>
       </w:r>
       <w:r>
         <w:rPr>
           <w:noProof/>
           <w:lang w:val="en-IN"/>
         </w:rPr>
-        <w:t xml:space="preserve"> 2. This suggests HTM’s superior ability to generalize sparse patterns, likely due to its biologically inspired temporal learning mechanism.</w:t>
+        <w:t>3</w:t>
+      </w:r>
+      <w:r>
+        <w:rPr>
+          <w:noProof/>
+          <w:lang w:val="en-IN"/>
+        </w:rPr>
+        <w:t xml:space="preserve"> shows how the HTM classifier performed the reco</w:t>
+      </w:r>
+      <w:r>
+        <w:rPr>
+          <w:noProof/>
+          <w:lang w:val="en-IN"/>
+        </w:rPr>
+        <w:t>nstr</w:t>
+      </w:r>
+      <w:r>
+        <w:rPr>
+          <w:noProof/>
+          <w:lang w:val="en-IN"/>
+        </w:rPr>
+        <w:t xml:space="preserve">uction. Fig. 5 represents the HTM plots from the </w:t>
+      </w:r>
+      <w:r>
+        <w:rPr>
+          <w:noProof/>
+          <w:lang w:val="en-IN"/>
+        </w:rPr>
+        <w:t>T</w:t>
+      </w:r>
+      <w:r>
+        <w:rPr>
+          <w:noProof/>
+          <w:lang w:val="en-IN"/>
+        </w:rPr>
+        <w:t>able</w:t>
+      </w:r>
+      <w:r>
+        <w:rPr>
+          <w:noProof/>
+          <w:lang w:val="en-IN"/>
+        </w:rPr>
+        <w:t xml:space="preserve"> </w:t>
+      </w:r>
+      <w:r>
+        <w:rPr>
+          <w:noProof/>
+          <w:lang w:val="en-IN"/>
+        </w:rPr>
+        <w:t>3</w:t>
+      </w:r>
+      <w:r>
+        <w:rPr>
+          <w:noProof/>
+          <w:lang w:val="en-IN"/>
+        </w:rPr>
+        <w:t>. This suggests HTM’s superior ability to generalize sparse patterns, likely due to its biologically inspired temporal learning mechanism.</w:t>
       </w:r>
     </w:p>
     <w:p>
@@ -6561,7 +7252,25 @@
           <w:noProof/>
           <w:lang w:val="en-IN"/>
         </w:rPr>
-        <w:t>Table 1: KNN reconstruction table for test data</w:t>
+        <w:t xml:space="preserve">Table </w:t>
+      </w:r>
+      <w:r>
+        <w:rPr>
+          <w:i/>
+          <w:iCs/>
+          <w:noProof/>
+          <w:lang w:val="en-IN"/>
+        </w:rPr>
+        <w:t>2</w:t>
+      </w:r>
+      <w:r>
+        <w:rPr>
+          <w:i/>
+          <w:iCs/>
+          <w:noProof/>
+          <w:lang w:val="en-IN"/>
+        </w:rPr>
+        <w:t>: KNN reconstruction table for test data</w:t>
       </w:r>
     </w:p>
     <w:p>
@@ -6665,6 +7374,16 @@
         </w:rPr>
       </w:pPr>
     </w:p>
+    <w:p>
+      <w:pPr>
+        <w:rPr>
+          <w:i/>
+          <w:iCs/>
+          <w:noProof/>
+          <w:lang w:val="en-IN"/>
+        </w:rPr>
+      </w:pPr>
+    </w:p>
     <w:tbl>
       <w:tblPr>
         <w:tblW w:w="0" w:type="auto"/>
@@ -6713,6 +7432,7 @@
                 <w:sz w:val="22"/>
                 <w:szCs w:val="22"/>
               </w:rPr>
+              <w:lastRenderedPageBreak/>
               <w:t>HTM Test Data Reconstruction</w:t>
             </w:r>
           </w:p>
@@ -7225,62 +7945,51 @@
           <w:noProof/>
           <w:lang w:val="en-IN"/>
         </w:rPr>
-        <w:t>Table 2: HTM reconstruction table for test data (case 1)</w:t>
-      </w:r>
-    </w:p>
-    <w:p>
-      <w:pPr>
+        <w:t xml:space="preserve">Table </w:t>
+      </w:r>
+      <w:r>
         <w:rPr>
           <w:i/>
           <w:iCs/>
           <w:noProof/>
           <w:lang w:val="en-IN"/>
         </w:rPr>
-      </w:pPr>
-    </w:p>
-    <w:p>
-      <w:pPr>
-        <w:jc w:val="left"/>
+        <w:t>3</w:t>
+      </w:r>
+      <w:r>
         <w:rPr>
           <w:i/>
           <w:iCs/>
           <w:noProof/>
           <w:lang w:val="en-IN"/>
         </w:rPr>
-      </w:pPr>
-      <w:r>
+        <w:t>: HTM reconstruction table for test data (case 1)</w:t>
+      </w:r>
+    </w:p>
+    <w:p>
+      <w:pPr>
+        <w:jc w:val="left"/>
         <w:rPr>
           <w:i/>
           <w:iCs/>
           <w:noProof/>
           <w:lang w:val="en-IN"/>
         </w:rPr>
-        <w:br w:type="page"/>
-      </w:r>
+      </w:pPr>
     </w:p>
     <w:p>
       <w:pPr>
         <w:rPr>
           <w:i/>
           <w:iCs/>
+        </w:rPr>
+      </w:pPr>
+      <w:r>
+        <w:rPr>
           <w:noProof/>
-          <w:lang w:val="en-IN"/>
-        </w:rPr>
-      </w:pPr>
-    </w:p>
-    <w:p>
-      <w:pPr>
-        <w:rPr>
-          <w:i/>
-          <w:iCs/>
-        </w:rPr>
-      </w:pPr>
-      <w:r>
-        <w:rPr>
-          <w:noProof/>
         </w:rPr>
         <w:drawing>
-          <wp:inline distT="0" distB="0" distL="0" distR="0" wp14:anchorId="1CB09859" wp14:editId="7975B579">
+          <wp:inline distT="0" distB="0" distL="0" distR="0" wp14:anchorId="1CB09859" wp14:editId="48A0D517">
             <wp:extent cx="2745049" cy="2474768"/>
             <wp:effectExtent l="19050" t="19050" r="17780" b="20955"/>
             <wp:docPr id="584146796" name="Picture 584146796"/>
@@ -7367,266 +8076,210 @@
           <w:noProof/>
           <w:lang w:val="en-IN"/>
         </w:rPr>
-        <w:t>Fig. 6 highlights HTM’s advantage over KNN, with higher similarity peaks (e.g., inputs 1, 3, 13</w:t>
+        <w:t xml:space="preserve">Fig. 6 </w:t>
       </w:r>
       <w:r>
         <w:rPr>
           <w:noProof/>
           <w:lang w:val="en-IN"/>
         </w:rPr>
-        <w:t>)</w:t>
+        <w:t>is the plot for Percenatge Similarity. This is comp</w:t>
       </w:r>
       <w:r>
         <w:rPr>
           <w:noProof/>
           <w:lang w:val="en-IN"/>
         </w:rPr>
-        <w:t xml:space="preserve">, as the red line is taller </w:t>
+        <w:t>a</w:t>
       </w:r>
       <w:r>
         <w:rPr>
           <w:noProof/>
           <w:lang w:val="en-IN"/>
         </w:rPr>
-        <w:t>than blue line</w:t>
+        <w:t xml:space="preserve">rison of </w:t>
       </w:r>
       <w:r>
         <w:rPr>
           <w:noProof/>
           <w:lang w:val="en-IN"/>
         </w:rPr>
-        <w:t xml:space="preserve"> </w:t>
+        <w:t xml:space="preserve">scalar numbers. Fig. 7 </w:t>
       </w:r>
       <w:r>
         <w:rPr>
           <w:noProof/>
           <w:lang w:val="en-IN"/>
         </w:rPr>
-        <w:t xml:space="preserve">signifying better </w:t>
+        <w:t xml:space="preserve">is the plot for </w:t>
       </w:r>
       <w:r>
         <w:rPr>
           <w:noProof/>
           <w:lang w:val="en-IN"/>
         </w:rPr>
-        <w:t>percentage</w:t>
+        <w:t xml:space="preserve">Internal Similarity. This is for </w:t>
       </w:r>
       <w:r>
         <w:rPr>
           <w:noProof/>
           <w:lang w:val="en-IN"/>
         </w:rPr>
-        <w:t xml:space="preserve"> </w:t>
+        <w:t>SDR comparison.</w:t>
       </w:r>
       <w:r>
         <w:rPr>
           <w:noProof/>
           <w:lang w:val="en-IN"/>
         </w:rPr>
-        <w:t>similarity</w:t>
+        <w:t xml:space="preserve"> </w:t>
       </w:r>
       <w:r>
         <w:rPr>
           <w:noProof/>
           <w:lang w:val="en-IN"/>
         </w:rPr>
-        <w:t>.</w:t>
+        <w:t xml:space="preserve">Both the plots show </w:t>
       </w:r>
       <w:r>
         <w:rPr>
           <w:noProof/>
           <w:lang w:val="en-IN"/>
         </w:rPr>
-        <w:t xml:space="preserve"> For instance, HTM achieved much better similarity at lower inputs compared to KNN demonstrating its robustness in reconstructing complex patterns.</w:t>
+        <w:t>HTM’s advantage over KNN, with higher similarity peaks (e.g., inputs 1, 3, 13)</w:t>
       </w:r>
       <w:r>
         <w:rPr>
           <w:noProof/>
           <w:lang w:val="en-IN"/>
         </w:rPr>
-        <w:t xml:space="preserve"> </w:t>
+        <w:t xml:space="preserve">, as the red line is taller </w:t>
       </w:r>
       <w:r>
         <w:rPr>
           <w:noProof/>
           <w:lang w:val="en-IN"/>
         </w:rPr>
-        <w:t xml:space="preserve">But </w:t>
+        <w:t>than blue line</w:t>
       </w:r>
       <w:r>
         <w:rPr>
           <w:noProof/>
           <w:lang w:val="en-IN"/>
         </w:rPr>
-        <w:t>for</w:t>
+        <w:t xml:space="preserve"> signifying better percentage</w:t>
       </w:r>
       <w:r>
         <w:rPr>
           <w:noProof/>
           <w:lang w:val="en-IN"/>
         </w:rPr>
-        <w:t xml:space="preserve"> input 17,</w:t>
+        <w:t xml:space="preserve"> similarity</w:t>
       </w:r>
       <w:r>
         <w:rPr>
           <w:noProof/>
           <w:lang w:val="en-IN"/>
         </w:rPr>
-        <w:t xml:space="preserve"> </w:t>
+        <w:t>. For instance, HTM achieved much better similarity at lower inputs compared to KNN demonstrating its robustness in reconstructing complex patterns.</w:t>
       </w:r>
       <w:r>
         <w:rPr>
           <w:noProof/>
           <w:lang w:val="en-IN"/>
         </w:rPr>
-        <w:t xml:space="preserve">both classifiers </w:t>
+        <w:t xml:space="preserve"> But </w:t>
       </w:r>
       <w:r>
         <w:rPr>
           <w:noProof/>
           <w:lang w:val="en-IN"/>
         </w:rPr>
-        <w:t>missed</w:t>
+        <w:t>for</w:t>
       </w:r>
       <w:r>
         <w:rPr>
           <w:noProof/>
           <w:lang w:val="en-IN"/>
         </w:rPr>
-        <w:t xml:space="preserve"> the </w:t>
+        <w:t xml:space="preserve"> input 17,</w:t>
       </w:r>
       <w:r>
         <w:rPr>
           <w:noProof/>
           <w:lang w:val="en-IN"/>
         </w:rPr>
-        <w:t>reconstru</w:t>
+        <w:t xml:space="preserve"> </w:t>
       </w:r>
       <w:r>
         <w:rPr>
           <w:noProof/>
           <w:lang w:val="en-IN"/>
         </w:rPr>
-        <w:t>ction</w:t>
+        <w:t xml:space="preserve">both classifiers </w:t>
       </w:r>
       <w:r>
         <w:rPr>
           <w:noProof/>
           <w:lang w:val="en-IN"/>
         </w:rPr>
-        <w:t xml:space="preserve"> by one </w:t>
+        <w:t xml:space="preserve">missed the </w:t>
       </w:r>
       <w:r>
         <w:rPr>
           <w:noProof/>
           <w:lang w:val="en-IN"/>
         </w:rPr>
-        <w:t>numeric value</w:t>
+        <w:t>reconstru</w:t>
       </w:r>
       <w:r>
         <w:rPr>
           <w:noProof/>
           <w:lang w:val="en-IN"/>
         </w:rPr>
-        <w:t>.</w:t>
+        <w:t>ction by one numeric value</w:t>
       </w:r>
       <w:r>
         <w:rPr>
           <w:noProof/>
           <w:lang w:val="en-IN"/>
         </w:rPr>
-        <w:t xml:space="preserve"> </w:t>
+        <w:t>.</w:t>
       </w:r>
       <w:r>
         <w:rPr>
           <w:noProof/>
           <w:lang w:val="en-IN"/>
         </w:rPr>
-        <w:t xml:space="preserve">Hence the percentage similarity peaks are same (red line and blue line have similar height). However, </w:t>
+        <w:t xml:space="preserve"> </w:t>
       </w:r>
       <w:r>
         <w:rPr>
           <w:noProof/>
           <w:lang w:val="en-IN"/>
         </w:rPr>
-        <w:t xml:space="preserve">for this input </w:t>
+        <w:t xml:space="preserve">Hence the percentage similarity peaks are same (red line and blue line have similar height). However, for this input if we look </w:t>
       </w:r>
       <w:r>
         <w:rPr>
           <w:noProof/>
           <w:lang w:val="en-IN"/>
         </w:rPr>
-        <w:t xml:space="preserve">if we look </w:t>
+        <w:t>the internal similarit</w:t>
       </w:r>
       <w:r>
         <w:rPr>
           <w:noProof/>
           <w:lang w:val="en-IN"/>
         </w:rPr>
-        <w:t>the internal</w:t>
+        <w:t>y</w:t>
       </w:r>
       <w:r>
         <w:rPr>
           <w:noProof/>
           <w:lang w:val="en-IN"/>
         </w:rPr>
-        <w:t xml:space="preserve"> </w:t>
-      </w:r>
-      <w:r>
-        <w:rPr>
-          <w:noProof/>
-          <w:lang w:val="en-IN"/>
-        </w:rPr>
-        <w:t>similarit</w:t>
-      </w:r>
-      <w:r>
-        <w:rPr>
-          <w:noProof/>
-          <w:lang w:val="en-IN"/>
-        </w:rPr>
-        <w:t>y metric</w:t>
-      </w:r>
-      <w:r>
-        <w:rPr>
-          <w:noProof/>
-          <w:lang w:val="en-IN"/>
-        </w:rPr>
-        <w:t xml:space="preserve"> from Table </w:t>
-      </w:r>
-      <w:r>
-        <w:rPr>
-          <w:noProof/>
-          <w:lang w:val="en-IN"/>
-        </w:rPr>
-        <w:t xml:space="preserve">1 and Table </w:t>
-      </w:r>
-      <w:r>
-        <w:rPr>
-          <w:noProof/>
-          <w:lang w:val="en-IN"/>
-        </w:rPr>
-        <w:t>2</w:t>
-      </w:r>
-      <w:r>
-        <w:rPr>
-          <w:noProof/>
-          <w:lang w:val="en-IN"/>
-        </w:rPr>
-        <w:t xml:space="preserve">, </w:t>
-      </w:r>
-      <w:r>
-        <w:rPr>
-          <w:noProof/>
-          <w:lang w:val="en-IN"/>
-        </w:rPr>
-        <w:t>HTM performed</w:t>
-      </w:r>
-      <w:r>
-        <w:rPr>
-          <w:noProof/>
-          <w:lang w:val="en-IN"/>
-        </w:rPr>
-        <w:t xml:space="preserve"> better.</w:t>
+        <w:t>, HTM performed better.</w:t>
       </w:r>
     </w:p>
     <w:p>
@@ -7653,10 +8306,10 @@
           <w:noProof/>
         </w:rPr>
         <w:drawing>
-          <wp:inline distT="0" distB="0" distL="0" distR="0" wp14:anchorId="24AA7C43" wp14:editId="15FA6E69">
-            <wp:extent cx="2852625" cy="2571750"/>
-            <wp:effectExtent l="19050" t="19050" r="24130" b="19050"/>
-            <wp:docPr id="105059502" name="Picture 105059502"/>
+          <wp:inline distT="0" distB="0" distL="0" distR="0" wp14:anchorId="45355A50" wp14:editId="2202682B">
+            <wp:extent cx="2867660" cy="2585306"/>
+            <wp:effectExtent l="19050" t="19050" r="27940" b="24765"/>
+            <wp:docPr id="1747582150" name="Picture 1747582150"/>
             <wp:cNvGraphicFramePr>
               <a:graphicFrameLocks xmlns:a="http://schemas.openxmlformats.org/drawingml/2006/main" noChangeAspect="1"/>
             </wp:cNvGraphicFramePr>
@@ -7664,7 +8317,7 @@
               <a:graphicData uri="http://schemas.openxmlformats.org/drawingml/2006/picture">
                 <pic:pic xmlns:pic="http://schemas.openxmlformats.org/drawingml/2006/picture">
                   <pic:nvPicPr>
-                    <pic:cNvPr id="0" name="Picture 1291357308"/>
+                    <pic:cNvPr id="0" name=""/>
                     <pic:cNvPicPr/>
                   </pic:nvPicPr>
                   <pic:blipFill>
@@ -7682,7 +8335,7 @@
                   <pic:spPr>
                     <a:xfrm>
                       <a:off x="0" y="0"/>
-                      <a:ext cx="2875128" cy="2592037"/>
+                      <a:ext cx="2878674" cy="2595236"/>
                     </a:xfrm>
                     <a:prstGeom prst="rect">
                       <a:avLst/>
@@ -7719,12 +8372,123 @@
           <w:sz w:val="20"/>
           <w:lang w:val="en-IN"/>
         </w:rPr>
-        <w:t>Fig. 6:  Similarity plot for test data (case 1)</w:t>
-      </w:r>
-    </w:p>
-    <w:p>
-      <w:pPr>
-        <w:rPr>
+        <w:t xml:space="preserve">Fig. 6:  </w:t>
+      </w:r>
+      <w:r>
+        <w:rPr>
+          <w:rStyle w:val="FigureChar"/>
+          <w:i/>
+          <w:iCs/>
+          <w:sz w:val="20"/>
+          <w:lang w:val="en-IN"/>
+        </w:rPr>
+        <w:t xml:space="preserve">Percentage </w:t>
+      </w:r>
+      <w:r>
+        <w:rPr>
+          <w:rStyle w:val="FigureChar"/>
+          <w:i/>
+          <w:iCs/>
+          <w:sz w:val="20"/>
+          <w:lang w:val="en-IN"/>
+        </w:rPr>
+        <w:t>Similarity plot for test data (case 1)</w:t>
+      </w:r>
+    </w:p>
+    <w:p>
+      <w:pPr>
+        <w:rPr>
+          <w:rStyle w:val="FigureChar"/>
+          <w:i/>
+          <w:iCs/>
+          <w:sz w:val="20"/>
+          <w:lang w:val="en-IN"/>
+        </w:rPr>
+      </w:pPr>
+    </w:p>
+    <w:p>
+      <w:pPr>
+        <w:rPr>
+          <w:rStyle w:val="FigureChar"/>
+          <w:i/>
+          <w:iCs/>
+          <w:sz w:val="20"/>
+          <w:lang w:val="en-IN"/>
+        </w:rPr>
+      </w:pPr>
+      <w:r>
+        <w:rPr>
+          <w:noProof/>
+        </w:rPr>
+        <w:drawing>
+          <wp:inline distT="0" distB="0" distL="0" distR="0" wp14:anchorId="578C4098" wp14:editId="442F5406">
+            <wp:extent cx="2850088" cy="2569464"/>
+            <wp:effectExtent l="12700" t="12700" r="12700" b="12700"/>
+            <wp:docPr id="1172571434" name="Picture 1172571434"/>
+            <wp:cNvGraphicFramePr>
+              <a:graphicFrameLocks xmlns:a="http://schemas.openxmlformats.org/drawingml/2006/main" noChangeAspect="1"/>
+            </wp:cNvGraphicFramePr>
+            <a:graphic xmlns:a="http://schemas.openxmlformats.org/drawingml/2006/main">
+              <a:graphicData uri="http://schemas.openxmlformats.org/drawingml/2006/picture">
+                <pic:pic xmlns:pic="http://schemas.openxmlformats.org/drawingml/2006/picture">
+                  <pic:nvPicPr>
+                    <pic:cNvPr id="0" name=""/>
+                    <pic:cNvPicPr/>
+                  </pic:nvPicPr>
+                  <pic:blipFill>
+                    <a:blip r:embed="rId28">
+                      <a:extLst>
+                        <a:ext uri="{28A0092B-C50C-407E-A947-70E740481C1C}">
+                          <a14:useLocalDpi xmlns:a14="http://schemas.microsoft.com/office/drawing/2010/main" val="0"/>
+                        </a:ext>
+                      </a:extLst>
+                    </a:blip>
+                    <a:stretch>
+                      <a:fillRect/>
+                    </a:stretch>
+                  </pic:blipFill>
+                  <pic:spPr>
+                    <a:xfrm>
+                      <a:off x="0" y="0"/>
+                      <a:ext cx="2850088" cy="2569464"/>
+                    </a:xfrm>
+                    <a:prstGeom prst="rect">
+                      <a:avLst/>
+                    </a:prstGeom>
+                    <a:ln w="12700">
+                      <a:solidFill>
+                        <a:schemeClr val="tx1"/>
+                      </a:solidFill>
+                      <a:prstDash val="solid"/>
+                    </a:ln>
+                  </pic:spPr>
+                </pic:pic>
+              </a:graphicData>
+            </a:graphic>
+          </wp:inline>
+        </w:drawing>
+      </w:r>
+    </w:p>
+    <w:p>
+      <w:pPr>
+        <w:rPr>
+          <w:lang w:val="en-IN"/>
+        </w:rPr>
+      </w:pPr>
+      <w:r>
+        <w:rPr>
+          <w:i/>
+          <w:iCs/>
+          <w:lang w:val="en-IN"/>
+        </w:rPr>
+        <w:t>Fig. 7: Internal Similarity plot for test data (case 1)</w:t>
+      </w:r>
+    </w:p>
+    <w:p>
+      <w:pPr>
+        <w:rPr>
+          <w:i/>
+          <w:iCs/>
           <w:lang w:val="en-IN"/>
         </w:rPr>
       </w:pPr>
@@ -7813,7 +8577,7 @@
           <w:noProof/>
           <w:lang w:val="en-IN"/>
         </w:rPr>
-        <w:t>3</w:t>
+        <w:t>4</w:t>
       </w:r>
       <w:r>
         <w:rPr>
@@ -7827,105 +8591,77 @@
           <w:noProof/>
           <w:lang w:val="en-IN"/>
         </w:rPr>
-        <w:t>7</w:t>
+        <w:t>8</w:t>
       </w:r>
       <w:r>
         <w:rPr>
           <w:noProof/>
           <w:lang w:val="en-IN"/>
         </w:rPr>
-        <w:t xml:space="preserve"> represents the KNN plots from the </w:t>
+        <w:t xml:space="preserve"> represents the KNN plots from the Table </w:t>
       </w:r>
       <w:r>
         <w:rPr>
           <w:noProof/>
           <w:lang w:val="en-IN"/>
         </w:rPr>
-        <w:t>Table</w:t>
+        <w:t>4</w:t>
       </w:r>
       <w:r>
         <w:rPr>
           <w:noProof/>
           <w:lang w:val="en-IN"/>
         </w:rPr>
-        <w:t xml:space="preserve"> </w:t>
+        <w:t xml:space="preserve">. In contrast, Table </w:t>
       </w:r>
       <w:r>
         <w:rPr>
           <w:noProof/>
           <w:lang w:val="en-IN"/>
         </w:rPr>
-        <w:t>3</w:t>
+        <w:t>5</w:t>
       </w:r>
       <w:r>
         <w:rPr>
           <w:noProof/>
           <w:lang w:val="en-IN"/>
         </w:rPr>
-        <w:t xml:space="preserve">. In contrast, Table </w:t>
+        <w:t xml:space="preserve"> shows how the HTM classifier performed the recon</w:t>
       </w:r>
       <w:r>
         <w:rPr>
           <w:noProof/>
           <w:lang w:val="en-IN"/>
         </w:rPr>
-        <w:t>4</w:t>
+        <w:t>s</w:t>
       </w:r>
       <w:r>
         <w:rPr>
           <w:noProof/>
           <w:lang w:val="en-IN"/>
         </w:rPr>
-        <w:t xml:space="preserve"> shows how the HTM classifier performed the recon</w:t>
+        <w:t xml:space="preserve">truction. Fig. </w:t>
       </w:r>
       <w:r>
         <w:rPr>
           <w:noProof/>
           <w:lang w:val="en-IN"/>
         </w:rPr>
-        <w:t>s</w:t>
+        <w:t>9</w:t>
       </w:r>
       <w:r>
         <w:rPr>
           <w:noProof/>
           <w:lang w:val="en-IN"/>
         </w:rPr>
-        <w:t xml:space="preserve">truction. Fig. </w:t>
+        <w:t xml:space="preserve"> represents the HTM plots from the Table </w:t>
       </w:r>
       <w:r>
         <w:rPr>
           <w:noProof/>
           <w:lang w:val="en-IN"/>
         </w:rPr>
-        <w:t>8</w:t>
-      </w:r>
-      <w:r>
-        <w:rPr>
-          <w:noProof/>
-          <w:lang w:val="en-IN"/>
-        </w:rPr>
-        <w:t xml:space="preserve"> represents the HTM plots from the </w:t>
-      </w:r>
-      <w:r>
-        <w:rPr>
-          <w:noProof/>
-          <w:lang w:val="en-IN"/>
-        </w:rPr>
-        <w:t>T</w:t>
-      </w:r>
-      <w:r>
-        <w:rPr>
-          <w:noProof/>
-          <w:lang w:val="en-IN"/>
-        </w:rPr>
-        <w:t xml:space="preserve">able </w:t>
-      </w:r>
-      <w:r>
-        <w:rPr>
-          <w:noProof/>
-          <w:lang w:val="en-IN"/>
-        </w:rPr>
-        <w:t>4</w:t>
+        <w:t>5</w:t>
       </w:r>
       <w:r>
         <w:rPr>
@@ -8609,6 +9345,7 @@
                 <w:sz w:val="22"/>
                 <w:szCs w:val="22"/>
               </w:rPr>
+              <w:lastRenderedPageBreak/>
               <w:t>21</w:t>
             </w:r>
           </w:p>
@@ -9085,7 +9822,7 @@
           <w:noProof/>
           <w:lang w:val="en-IN"/>
         </w:rPr>
-        <w:t>3</w:t>
+        <w:t>4</w:t>
       </w:r>
       <w:r>
         <w:rPr>
@@ -9116,7 +9853,7 @@
           <w:noProof/>
         </w:rPr>
         <w:drawing>
-          <wp:inline distT="0" distB="0" distL="0" distR="0" wp14:anchorId="33E2C9F2" wp14:editId="351ECB9A">
+          <wp:inline distT="0" distB="0" distL="0" distR="0" wp14:anchorId="33E2C9F2" wp14:editId="584776AE">
             <wp:extent cx="3095625" cy="2143125"/>
             <wp:effectExtent l="12700" t="12700" r="12700" b="12700"/>
             <wp:docPr id="215417090" name="Picture 215417090"/>
@@ -9127,11 +9864,11 @@
               <a:graphicData uri="http://schemas.openxmlformats.org/drawingml/2006/picture">
                 <pic:pic xmlns:pic="http://schemas.openxmlformats.org/drawingml/2006/picture">
                   <pic:nvPicPr>
-                    <pic:cNvPr id="0" name="Picture 1515601597"/>
+                    <pic:cNvPr id="0" name="Picture 215417090"/>
                     <pic:cNvPicPr/>
                   </pic:nvPicPr>
                   <pic:blipFill>
-                    <a:blip r:embed="rId28" cstate="print">
+                    <a:blip r:embed="rId29" cstate="print">
                       <a:extLst>
                         <a:ext uri="{28A0092B-C50C-407E-A947-70E740481C1C}">
                           <a14:useLocalDpi xmlns:a14="http://schemas.microsoft.com/office/drawing/2010/main" val="0"/>
@@ -9179,7 +9916,7 @@
           <w:noProof/>
           <w:lang w:val="en-IN"/>
         </w:rPr>
-        <w:t>7</w:t>
+        <w:t>8</w:t>
       </w:r>
       <w:r>
         <w:rPr>
@@ -10346,7 +11083,7 @@
           <w:noProof/>
           <w:lang w:val="en-IN"/>
         </w:rPr>
-        <w:t>4</w:t>
+        <w:t>5</w:t>
       </w:r>
       <w:r>
         <w:rPr>
@@ -10379,9 +11116,8 @@
         <w:rPr>
           <w:noProof/>
         </w:rPr>
-        <w:lastRenderedPageBreak/>
         <w:drawing>
-          <wp:inline distT="0" distB="0" distL="0" distR="0" wp14:anchorId="679C051B" wp14:editId="62D58A12">
+          <wp:inline distT="0" distB="0" distL="0" distR="0" wp14:anchorId="679C051B" wp14:editId="7E1A76AB">
             <wp:extent cx="3158913" cy="2186940"/>
             <wp:effectExtent l="12700" t="12700" r="12700" b="12700"/>
             <wp:docPr id="106500382" name="Picture 106500382"/>
@@ -10392,11 +11128,11 @@
               <a:graphicData uri="http://schemas.openxmlformats.org/drawingml/2006/picture">
                 <pic:pic xmlns:pic="http://schemas.openxmlformats.org/drawingml/2006/picture">
                   <pic:nvPicPr>
-                    <pic:cNvPr id="0" name="Picture 240842320"/>
+                    <pic:cNvPr id="0" name="Picture 106500382"/>
                     <pic:cNvPicPr/>
                   </pic:nvPicPr>
                   <pic:blipFill>
-                    <a:blip r:embed="rId29" cstate="print">
+                    <a:blip r:embed="rId30" cstate="print">
                       <a:extLst>
                         <a:ext uri="{28A0092B-C50C-407E-A947-70E740481C1C}">
                           <a14:useLocalDpi xmlns:a14="http://schemas.microsoft.com/office/drawing/2010/main" val="0"/>
@@ -10451,7 +11187,7 @@
           <w:noProof/>
           <w:lang w:val="en-IN"/>
         </w:rPr>
-        <w:t>8</w:t>
+        <w:t>9</w:t>
       </w:r>
       <w:r>
         <w:rPr>
@@ -10481,7 +11217,7 @@
         <w:t xml:space="preserve">Fig. </w:t>
       </w:r>
       <w:r>
-        <w:t>9</w:t>
+        <w:t>10</w:t>
       </w:r>
       <w:r>
         <w:t xml:space="preserve"> highlights that in this case also HTM performed much better than KNN, very evident from the </w:t>
@@ -10505,10 +11241,16 @@
         <w:t>10, 17, 19, 20, 21)</w:t>
       </w:r>
       <w:r>
-        <w:t>. However, where both lines have similar peaks, if we check the internal similarities (</w:t>
-      </w:r>
-      <w:r>
-        <w:t>Table 3 &amp; Table 4), we notice that HTM performed better.</w:t>
+        <w:t xml:space="preserve">. However, if we check the internal similarities </w:t>
+      </w:r>
+      <w:r>
+        <w:t>Fig. 11</w:t>
+      </w:r>
+      <w:r>
+        <w:t xml:space="preserve">, we notice that </w:t>
+      </w:r>
+      <w:r>
+        <w:t>KNN have 0% match with SDR comparison.</w:t>
       </w:r>
     </w:p>
     <w:p>
@@ -10519,6 +11261,9 @@
     <w:p>
       <w:pPr>
         <w:rPr>
+          <w:rStyle w:val="FigureChar"/>
+          <w:i/>
+          <w:iCs/>
           <w:lang w:val="en-IN"/>
         </w:rPr>
       </w:pPr>
@@ -10527,10 +11272,10 @@
           <w:noProof/>
         </w:rPr>
         <w:drawing>
-          <wp:inline distT="0" distB="0" distL="0" distR="0" wp14:anchorId="36C56C7C" wp14:editId="02CF394A">
-            <wp:extent cx="3123559" cy="2162464"/>
-            <wp:effectExtent l="19050" t="19050" r="20320" b="9525"/>
-            <wp:docPr id="956217734" name="Picture 462314569"/>
+          <wp:inline distT="0" distB="0" distL="0" distR="0" wp14:anchorId="5DA19032" wp14:editId="68C58F61">
+            <wp:extent cx="3095625" cy="2143125"/>
+            <wp:effectExtent l="12700" t="12700" r="12700" b="12700"/>
+            <wp:docPr id="138123765" name="Picture 138123765"/>
             <wp:cNvGraphicFramePr>
               <a:graphicFrameLocks xmlns:a="http://schemas.openxmlformats.org/drawingml/2006/main" noChangeAspect="1"/>
             </wp:cNvGraphicFramePr>
@@ -10538,11 +11283,11 @@
               <a:graphicData uri="http://schemas.openxmlformats.org/drawingml/2006/picture">
                 <pic:pic xmlns:pic="http://schemas.openxmlformats.org/drawingml/2006/picture">
                   <pic:nvPicPr>
-                    <pic:cNvPr id="0" name="Picture 462314569"/>
+                    <pic:cNvPr id="0" name=""/>
                     <pic:cNvPicPr/>
                   </pic:nvPicPr>
                   <pic:blipFill>
-                    <a:blip r:embed="rId30" cstate="print">
+                    <a:blip r:embed="rId31" cstate="print">
                       <a:extLst>
                         <a:ext uri="{28A0092B-C50C-407E-A947-70E740481C1C}">
                           <a14:useLocalDpi xmlns:a14="http://schemas.microsoft.com/office/drawing/2010/main" val="0"/>
@@ -10556,7 +11301,7 @@
                   <pic:spPr>
                     <a:xfrm>
                       <a:off x="0" y="0"/>
-                      <a:ext cx="3127169" cy="2164963"/>
+                      <a:ext cx="3095625" cy="2143125"/>
                     </a:xfrm>
                     <a:prstGeom prst="rect">
                       <a:avLst/>
@@ -10592,7 +11337,7 @@
           <w:sz w:val="20"/>
           <w:lang w:val="en-IN"/>
         </w:rPr>
-        <w:t>9</w:t>
+        <w:t>10</w:t>
       </w:r>
       <w:r>
         <w:rPr>
@@ -10602,7 +11347,27 @@
           <w:sz w:val="20"/>
           <w:lang w:val="en-IN"/>
         </w:rPr>
-        <w:t>: Similarity plot for test data (case 2)</w:t>
+        <w:t xml:space="preserve">: </w:t>
+      </w:r>
+      <w:r>
+        <w:rPr>
+          <w:rStyle w:val="FigureChar"/>
+          <w:i/>
+          <w:iCs/>
+          <w:sz w:val="20"/>
+          <w:lang w:val="en-IN"/>
+        </w:rPr>
+        <w:t xml:space="preserve">Percentage </w:t>
+      </w:r>
+      <w:r>
+        <w:rPr>
+          <w:rStyle w:val="FigureChar"/>
+          <w:i/>
+          <w:iCs/>
+          <w:sz w:val="20"/>
+          <w:lang w:val="en-IN"/>
+        </w:rPr>
+        <w:t>Similarity plot for test data (case 2)</w:t>
       </w:r>
       <w:r>
         <w:rPr>
@@ -10616,6 +11381,120 @@
     </w:p>
     <w:p>
       <w:pPr>
+        <w:rPr>
+          <w:rStyle w:val="FigureChar"/>
+          <w:i/>
+          <w:iCs/>
+          <w:lang w:val="en-IN"/>
+        </w:rPr>
+      </w:pPr>
+    </w:p>
+    <w:p>
+      <w:pPr>
+        <w:rPr>
+          <w:rStyle w:val="FigureChar"/>
+          <w:i/>
+          <w:iCs/>
+          <w:lang w:val="en-IN"/>
+        </w:rPr>
+      </w:pPr>
+    </w:p>
+    <w:p>
+      <w:pPr>
+        <w:rPr>
+          <w:rStyle w:val="FigureChar"/>
+          <w:i/>
+          <w:iCs/>
+          <w:sz w:val="20"/>
+          <w:lang w:val="en-IN"/>
+        </w:rPr>
+      </w:pPr>
+      <w:r>
+        <w:rPr>
+          <w:noProof/>
+        </w:rPr>
+        <w:drawing>
+          <wp:inline distT="0" distB="0" distL="0" distR="0" wp14:anchorId="7171AE6D" wp14:editId="5BE7DAE6">
+            <wp:extent cx="3095625" cy="2143125"/>
+            <wp:effectExtent l="12700" t="12700" r="12700" b="12700"/>
+            <wp:docPr id="775411578" name="Picture 775411578"/>
+            <wp:cNvGraphicFramePr>
+              <a:graphicFrameLocks xmlns:a="http://schemas.openxmlformats.org/drawingml/2006/main" noChangeAspect="1"/>
+            </wp:cNvGraphicFramePr>
+            <a:graphic xmlns:a="http://schemas.openxmlformats.org/drawingml/2006/main">
+              <a:graphicData uri="http://schemas.openxmlformats.org/drawingml/2006/picture">
+                <pic:pic xmlns:pic="http://schemas.openxmlformats.org/drawingml/2006/picture">
+                  <pic:nvPicPr>
+                    <pic:cNvPr id="0" name=""/>
+                    <pic:cNvPicPr/>
+                  </pic:nvPicPr>
+                  <pic:blipFill>
+                    <a:blip r:embed="rId32" cstate="print">
+                      <a:extLst>
+                        <a:ext uri="{28A0092B-C50C-407E-A947-70E740481C1C}">
+                          <a14:useLocalDpi xmlns:a14="http://schemas.microsoft.com/office/drawing/2010/main" val="0"/>
+                        </a:ext>
+                      </a:extLst>
+                    </a:blip>
+                    <a:stretch>
+                      <a:fillRect/>
+                    </a:stretch>
+                  </pic:blipFill>
+                  <pic:spPr>
+                    <a:xfrm>
+                      <a:off x="0" y="0"/>
+                      <a:ext cx="3095625" cy="2143125"/>
+                    </a:xfrm>
+                    <a:prstGeom prst="rect">
+                      <a:avLst/>
+                    </a:prstGeom>
+                    <a:ln w="12700">
+                      <a:solidFill>
+                        <a:schemeClr val="tx1"/>
+                      </a:solidFill>
+                      <a:prstDash val="solid"/>
+                    </a:ln>
+                  </pic:spPr>
+                </pic:pic>
+              </a:graphicData>
+            </a:graphic>
+          </wp:inline>
+        </w:drawing>
+      </w:r>
+      <w:r>
+        <w:rPr>
+          <w:rStyle w:val="FigureChar"/>
+          <w:i/>
+          <w:iCs/>
+          <w:sz w:val="20"/>
+          <w:lang w:val="en-IN"/>
+        </w:rPr>
+        <w:t>Fig. 11: Internal Similarity plot for test data (case 2)</w:t>
+      </w:r>
+    </w:p>
+    <w:p>
+      <w:pPr>
+        <w:rPr>
+          <w:rStyle w:val="FigureChar"/>
+          <w:i/>
+          <w:iCs/>
+          <w:sz w:val="20"/>
+          <w:lang w:val="en-IN"/>
+        </w:rPr>
+      </w:pPr>
+    </w:p>
+    <w:p>
+      <w:pPr>
+        <w:rPr>
+          <w:rStyle w:val="FigureChar"/>
+          <w:i/>
+          <w:iCs/>
+          <w:lang w:val="en-IN"/>
+        </w:rPr>
+      </w:pPr>
+    </w:p>
+    <w:p>
+      <w:pPr>
         <w:pStyle w:val="Heading2"/>
         <w:rPr>
           <w:b/>
@@ -10629,6 +11508,7 @@
           <w:bCs/>
           <w:lang w:val="en-IN"/>
         </w:rPr>
+        <w:lastRenderedPageBreak/>
         <w:t>Training Data Reconstruction</w:t>
       </w:r>
     </w:p>
@@ -10774,6 +11654,11 @@
       <w:r>
         <w:t>%.</w:t>
       </w:r>
+    </w:p>
+    <w:p>
+      <w:pPr>
+        <w:jc w:val="both"/>
+      </w:pPr>
     </w:p>
     <w:p>
       <w:pPr>
@@ -10816,7 +11701,7 @@
         <w:rPr>
           <w:lang w:val="en-IN"/>
         </w:rPr>
-        <w:t>5</w:t>
+        <w:t>6</w:t>
       </w:r>
       <w:r>
         <w:rPr>
@@ -10828,19 +11713,25 @@
         <w:rPr>
           <w:lang w:val="en-IN"/>
         </w:rPr>
-        <w:t>10</w:t>
+        <w:t>1</w:t>
       </w:r>
       <w:r>
         <w:rPr>
           <w:lang w:val="en-IN"/>
         </w:rPr>
+        <w:t>2</w:t>
+      </w:r>
+      <w:r>
+        <w:rPr>
+          <w:lang w:val="en-IN"/>
+        </w:rPr>
         <w:t xml:space="preserve"> for KNN and Table </w:t>
       </w:r>
       <w:r>
         <w:rPr>
           <w:lang w:val="en-IN"/>
         </w:rPr>
-        <w:t>6</w:t>
+        <w:t>7</w:t>
       </w:r>
       <w:r>
         <w:rPr>
@@ -10852,7 +11743,13 @@
         <w:rPr>
           <w:lang w:val="en-IN"/>
         </w:rPr>
-        <w:t>11</w:t>
+        <w:t>1</w:t>
+      </w:r>
+      <w:r>
+        <w:rPr>
+          <w:lang w:val="en-IN"/>
+        </w:rPr>
+        <w:t>3</w:t>
       </w:r>
       <w:r>
         <w:rPr>
@@ -12664,7 +13561,7 @@
           <w:iCs/>
           <w:lang w:val="en-IN"/>
         </w:rPr>
-        <w:t>5</w:t>
+        <w:t>6</w:t>
       </w:r>
       <w:r>
         <w:rPr>
@@ -12706,7 +13603,7 @@
                     <pic:cNvPicPr/>
                   </pic:nvPicPr>
                   <pic:blipFill>
-                    <a:blip r:embed="rId31">
+                    <a:blip r:embed="rId33">
                       <a:extLst>
                         <a:ext uri="{28A0092B-C50C-407E-A947-70E740481C1C}">
                           <a14:useLocalDpi xmlns:a14="http://schemas.microsoft.com/office/drawing/2010/main" val="0"/>
@@ -12767,7 +13664,17 @@
           <w:sz w:val="20"/>
           <w:lang w:val="en-IN"/>
         </w:rPr>
-        <w:t>10</w:t>
+        <w:t>1</w:t>
+      </w:r>
+      <w:r>
+        <w:rPr>
+          <w:rStyle w:val="FigureChar"/>
+          <w:i/>
+          <w:iCs/>
+          <w:sz w:val="20"/>
+          <w:lang w:val="en-IN"/>
+        </w:rPr>
+        <w:t>2</w:t>
       </w:r>
       <w:r>
         <w:rPr>
@@ -12840,7 +13747,6 @@
                 <w:sz w:val="22"/>
                 <w:szCs w:val="22"/>
               </w:rPr>
-              <w:lastRenderedPageBreak/>
               <w:t>HTM Train Data Reconstruction</w:t>
             </w:r>
           </w:p>
@@ -14517,7 +15423,7 @@
           <w:sz w:val="20"/>
           <w:lang w:val="en-IN"/>
         </w:rPr>
-        <w:t>6</w:t>
+        <w:t>7</w:t>
       </w:r>
       <w:r>
         <w:rPr>
@@ -14546,6 +15452,7 @@
         <w:rPr>
           <w:noProof/>
         </w:rPr>
+        <w:lastRenderedPageBreak/>
         <w:drawing>
           <wp:inline distT="0" distB="0" distL="0" distR="0" wp14:anchorId="56BE97B5" wp14:editId="68CEE00E">
             <wp:extent cx="2982608" cy="2688937"/>
@@ -14562,7 +15469,7 @@
                     <pic:cNvPicPr/>
                   </pic:nvPicPr>
                   <pic:blipFill>
-                    <a:blip r:embed="rId32">
+                    <a:blip r:embed="rId34">
                       <a:extLst>
                         <a:ext uri="{28A0092B-C50C-407E-A947-70E740481C1C}">
                           <a14:useLocalDpi xmlns:a14="http://schemas.microsoft.com/office/drawing/2010/main" val="0"/>
@@ -14622,7 +15529,7 @@
           <w:sz w:val="20"/>
           <w:lang w:val="en-IN"/>
         </w:rPr>
-        <w:t>11</w:t>
+        <w:t>1</w:t>
       </w:r>
       <w:r>
         <w:rPr>
@@ -14631,19 +15538,28 @@
           <w:sz w:val="20"/>
           <w:lang w:val="en-IN"/>
         </w:rPr>
-        <w:t>: HTM reconstruction plot for train data (case 1)</w:t>
-      </w:r>
-    </w:p>
-    <w:p>
-      <w:pPr>
-        <w:pStyle w:val="Figure"/>
-        <w:jc w:val="center"/>
+        <w:t>3</w:t>
+      </w:r>
+      <w:r>
         <w:rPr>
           <w:i/>
           <w:iCs/>
           <w:sz w:val="20"/>
           <w:lang w:val="en-IN"/>
         </w:rPr>
+        <w:t>: HTM reconstruction plot for train data (case 1)</w:t>
+      </w:r>
+    </w:p>
+    <w:p>
+      <w:pPr>
+        <w:pStyle w:val="Figure"/>
+        <w:jc w:val="center"/>
+        <w:rPr>
+          <w:i/>
+          <w:iCs/>
+          <w:sz w:val="20"/>
+          <w:lang w:val="en-IN"/>
+        </w:rPr>
       </w:pPr>
     </w:p>
     <w:p>
@@ -14666,63 +15582,49 @@
           <w:noProof/>
           <w:lang w:val="en-IN"/>
         </w:rPr>
-        <w:t>12</w:t>
+        <w:t>1</w:t>
       </w:r>
       <w:r>
         <w:rPr>
           <w:noProof/>
           <w:lang w:val="en-IN"/>
         </w:rPr>
-        <w:t xml:space="preserve"> </w:t>
+        <w:t>4</w:t>
       </w:r>
       <w:r>
         <w:rPr>
           <w:noProof/>
           <w:lang w:val="en-IN"/>
         </w:rPr>
-        <w:t xml:space="preserve">confirms both classifiers achieved 100% similarity </w:t>
+        <w:t xml:space="preserve"> </w:t>
       </w:r>
       <w:r>
         <w:rPr>
           <w:noProof/>
           <w:lang w:val="en-IN"/>
         </w:rPr>
-        <w:t>(red and blue lines have same height)</w:t>
+        <w:t xml:space="preserve">and Fig. 15 </w:t>
       </w:r>
       <w:r>
         <w:rPr>
           <w:noProof/>
           <w:lang w:val="en-IN"/>
         </w:rPr>
-        <w:t xml:space="preserve"> </w:t>
+        <w:t xml:space="preserve">confirms both classifiers achieved 100% similarity </w:t>
       </w:r>
       <w:r>
         <w:rPr>
           <w:noProof/>
           <w:lang w:val="en-IN"/>
         </w:rPr>
-        <w:t>on training data, reinforcing their memorization capability</w:t>
+        <w:t>(red and blue lines have same height)</w:t>
       </w:r>
       <w:r>
         <w:rPr>
           <w:noProof/>
           <w:lang w:val="en-IN"/>
         </w:rPr>
-        <w:t xml:space="preserve"> </w:t>
-      </w:r>
-      <w:r>
-        <w:rPr>
-          <w:noProof/>
-          <w:lang w:val="en-IN"/>
-        </w:rPr>
-        <w:t xml:space="preserve">with </w:t>
-      </w:r>
-      <w:r>
-        <w:rPr>
-          <w:noProof/>
-          <w:lang w:val="en-IN"/>
-        </w:rPr>
-        <w:t>known data.</w:t>
+        <w:t xml:space="preserve"> on training data, reinforcing their memorization capability with known data.</w:t>
       </w:r>
     </w:p>
     <w:p>
@@ -14740,7 +15642,6 @@
     <w:p>
       <w:pPr>
         <w:rPr>
-          <w:bCs/>
           <w:i/>
           <w:iCs/>
           <w:lang w:val="en-IN"/>
@@ -14751,10 +15652,10 @@
           <w:noProof/>
         </w:rPr>
         <w:drawing>
-          <wp:inline distT="0" distB="0" distL="0" distR="0" wp14:anchorId="6376691A" wp14:editId="50AAF97D">
-            <wp:extent cx="2980459" cy="2686999"/>
-            <wp:effectExtent l="19050" t="19050" r="10795" b="18415"/>
-            <wp:docPr id="722294460" name="Picture 722294460"/>
+          <wp:inline distT="0" distB="0" distL="0" distR="0" wp14:anchorId="1D4EB015" wp14:editId="641AA9FF">
+            <wp:extent cx="3095625" cy="2790825"/>
+            <wp:effectExtent l="12700" t="12700" r="12700" b="12700"/>
+            <wp:docPr id="1033502952" name="Picture 1033502952"/>
             <wp:cNvGraphicFramePr>
               <a:graphicFrameLocks xmlns:a="http://schemas.openxmlformats.org/drawingml/2006/main" noChangeAspect="1"/>
             </wp:cNvGraphicFramePr>
@@ -14762,11 +15663,11 @@
               <a:graphicData uri="http://schemas.openxmlformats.org/drawingml/2006/picture">
                 <pic:pic xmlns:pic="http://schemas.openxmlformats.org/drawingml/2006/picture">
                   <pic:nvPicPr>
-                    <pic:cNvPr id="0" name="Picture 240115355"/>
+                    <pic:cNvPr id="0" name=""/>
                     <pic:cNvPicPr/>
                   </pic:nvPicPr>
                   <pic:blipFill>
-                    <a:blip r:embed="rId33">
+                    <a:blip r:embed="rId35">
                       <a:extLst>
                         <a:ext uri="{28A0092B-C50C-407E-A947-70E740481C1C}">
                           <a14:useLocalDpi xmlns:a14="http://schemas.microsoft.com/office/drawing/2010/main" val="0"/>
@@ -14780,7 +15681,7 @@
                   <pic:spPr>
                     <a:xfrm>
                       <a:off x="0" y="0"/>
-                      <a:ext cx="3001932" cy="2706358"/>
+                      <a:ext cx="3095625" cy="2790825"/>
                     </a:xfrm>
                     <a:prstGeom prst="rect">
                       <a:avLst/>
@@ -14816,7 +15717,7 @@
           <w:sz w:val="20"/>
           <w:lang w:val="en-IN"/>
         </w:rPr>
-        <w:t>12</w:t>
+        <w:t>1</w:t>
       </w:r>
       <w:r>
         <w:rPr>
@@ -14826,12 +15727,130 @@
           <w:sz w:val="20"/>
           <w:lang w:val="en-IN"/>
         </w:rPr>
-        <w:t>:  Similarity plot for train data (case 1)</w:t>
-      </w:r>
-    </w:p>
-    <w:p>
-      <w:pPr>
-        <w:rPr>
+        <w:t>4</w:t>
+      </w:r>
+      <w:r>
+        <w:rPr>
+          <w:rStyle w:val="FigureChar"/>
+          <w:i/>
+          <w:iCs/>
+          <w:sz w:val="20"/>
+          <w:lang w:val="en-IN"/>
+        </w:rPr>
+        <w:t xml:space="preserve">:  </w:t>
+      </w:r>
+      <w:r>
+        <w:rPr>
+          <w:rStyle w:val="FigureChar"/>
+          <w:i/>
+          <w:iCs/>
+          <w:sz w:val="20"/>
+          <w:lang w:val="en-IN"/>
+        </w:rPr>
+        <w:t xml:space="preserve">Percentage </w:t>
+      </w:r>
+      <w:r>
+        <w:rPr>
+          <w:rStyle w:val="FigureChar"/>
+          <w:i/>
+          <w:iCs/>
+          <w:sz w:val="20"/>
+          <w:lang w:val="en-IN"/>
+        </w:rPr>
+        <w:t>Similarity plot for train data (case 1)</w:t>
+      </w:r>
+    </w:p>
+    <w:p>
+      <w:r>
+        <w:rPr>
+          <w:noProof/>
+        </w:rPr>
+        <w:drawing>
+          <wp:inline distT="0" distB="0" distL="0" distR="0" wp14:anchorId="1886BDA4" wp14:editId="37ED6DEB">
+            <wp:extent cx="3095625" cy="2790825"/>
+            <wp:effectExtent l="12700" t="12700" r="12700" b="12700"/>
+            <wp:docPr id="293707226" name="Picture 293707226"/>
+            <wp:cNvGraphicFramePr>
+              <a:graphicFrameLocks xmlns:a="http://schemas.openxmlformats.org/drawingml/2006/main" noChangeAspect="1"/>
+            </wp:cNvGraphicFramePr>
+            <a:graphic xmlns:a="http://schemas.openxmlformats.org/drawingml/2006/main">
+              <a:graphicData uri="http://schemas.openxmlformats.org/drawingml/2006/picture">
+                <pic:pic xmlns:pic="http://schemas.openxmlformats.org/drawingml/2006/picture">
+                  <pic:nvPicPr>
+                    <pic:cNvPr id="0" name=""/>
+                    <pic:cNvPicPr/>
+                  </pic:nvPicPr>
+                  <pic:blipFill>
+                    <a:blip r:embed="rId36">
+                      <a:extLst>
+                        <a:ext uri="{28A0092B-C50C-407E-A947-70E740481C1C}">
+                          <a14:useLocalDpi xmlns:a14="http://schemas.microsoft.com/office/drawing/2010/main" val="0"/>
+                        </a:ext>
+                      </a:extLst>
+                    </a:blip>
+                    <a:stretch>
+                      <a:fillRect/>
+                    </a:stretch>
+                  </pic:blipFill>
+                  <pic:spPr>
+                    <a:xfrm>
+                      <a:off x="0" y="0"/>
+                      <a:ext cx="3095625" cy="2790825"/>
+                    </a:xfrm>
+                    <a:prstGeom prst="rect">
+                      <a:avLst/>
+                    </a:prstGeom>
+                    <a:ln w="12700">
+                      <a:solidFill>
+                        <a:schemeClr val="tx1"/>
+                      </a:solidFill>
+                      <a:prstDash val="solid"/>
+                    </a:ln>
+                  </pic:spPr>
+                </pic:pic>
+              </a:graphicData>
+            </a:graphic>
+          </wp:inline>
+        </w:drawing>
+      </w:r>
+      <w:r>
+        <w:rPr>
+          <w:rStyle w:val="FigureChar"/>
+          <w:i/>
+          <w:iCs/>
+          <w:sz w:val="20"/>
+          <w:lang w:val="en-IN"/>
+        </w:rPr>
+        <w:t>Fig. 1</w:t>
+      </w:r>
+      <w:r>
+        <w:rPr>
+          <w:rStyle w:val="FigureChar"/>
+          <w:i/>
+          <w:iCs/>
+          <w:sz w:val="20"/>
+          <w:lang w:val="en-IN"/>
+        </w:rPr>
+        <w:t>5</w:t>
+      </w:r>
+      <w:r>
+        <w:rPr>
+          <w:rStyle w:val="FigureChar"/>
+          <w:i/>
+          <w:iCs/>
+          <w:sz w:val="20"/>
+          <w:lang w:val="en-IN"/>
+        </w:rPr>
+        <w:t>:  Internal Similarity plot for train data (case 1)</w:t>
+      </w:r>
+    </w:p>
+    <w:p>
+      <w:pPr>
+        <w:rPr>
+          <w:rStyle w:val="FigureChar"/>
+          <w:i/>
+          <w:iCs/>
+          <w:sz w:val="20"/>
           <w:lang w:val="en-IN"/>
         </w:rPr>
       </w:pPr>
@@ -14904,7 +15923,31 @@
         <w:jc w:val="both"/>
       </w:pPr>
       <w:r>
-        <w:t>Both the KNN and HTM demonstrated flawless reconstruction performance during training, achieving 100% similarity scores when tested on the 80% training data subset. As shown in Table 7, Fig. 13 (KNN) and Table 8, Fig. 14 (HTM), their predictions exhibited exact alignment with ground-truth values across all samples. Visualized results revealed a perfect diagonal distribution in prediction-versus-input matrices</w:t>
+        <w:t xml:space="preserve">Both the KNN and HTM demonstrated flawless reconstruction performance during training, achieving 100% similarity scores when tested on the 80% training data subset. As shown in Table </w:t>
+      </w:r>
+      <w:r>
+        <w:t>8</w:t>
+      </w:r>
+      <w:r>
+        <w:t>, Fig. 1</w:t>
+      </w:r>
+      <w:r>
+        <w:t>6</w:t>
+      </w:r>
+      <w:r>
+        <w:t xml:space="preserve"> (KNN) and Table </w:t>
+      </w:r>
+      <w:r>
+        <w:t>9</w:t>
+      </w:r>
+      <w:r>
+        <w:t>, Fig. 1</w:t>
+      </w:r>
+      <w:r>
+        <w:t>7</w:t>
+      </w:r>
+      <w:r>
+        <w:t xml:space="preserve"> (HTM), their predictions exhibited exact alignment with ground-truth values across all samples. Visualized results revealed a perfect diagonal distribution in prediction-versus-input matrices</w:t>
       </w:r>
       <w:r>
         <w:t xml:space="preserve"> (x=y)</w:t>
@@ -14912,6 +15955,11 @@
       <w:r>
         <w:t>, indicating error-free reconstruction where every output precisely mirrored its corresponding input. This identical performance across both classifiers highlights their optimal training-phase accuracy under the experimental conditions.</w:t>
       </w:r>
+    </w:p>
+    <w:p>
+      <w:pPr>
+        <w:jc w:val="both"/>
+      </w:pPr>
     </w:p>
     <w:p>
       <w:pPr>
@@ -17426,6 +18474,7 @@
                 <w:szCs w:val="22"/>
                 <w:lang w:val="en-IN" w:eastAsia="en-IN"/>
               </w:rPr>
+              <w:lastRenderedPageBreak/>
               <w:t>22</w:t>
             </w:r>
           </w:p>
@@ -17576,7 +18625,6 @@
                 <w:szCs w:val="22"/>
                 <w:lang w:val="en-IN" w:eastAsia="en-IN"/>
               </w:rPr>
-              <w:lastRenderedPageBreak/>
               <w:t>23</w:t>
             </w:r>
           </w:p>
@@ -21164,7 +22212,7 @@
           <w:iCs/>
           <w:lang w:val="en-IN"/>
         </w:rPr>
-        <w:t>7</w:t>
+        <w:t>8</w:t>
       </w:r>
       <w:r>
         <w:rPr>
@@ -21202,7 +22250,7 @@
           <w:noProof/>
         </w:rPr>
         <w:drawing>
-          <wp:inline distT="0" distB="0" distL="0" distR="0" wp14:anchorId="0B733320" wp14:editId="0FE5ED59">
+          <wp:inline distT="0" distB="0" distL="0" distR="0" wp14:anchorId="0B733320" wp14:editId="5FC32178">
             <wp:extent cx="3114887" cy="2156460"/>
             <wp:effectExtent l="12700" t="12700" r="12700" b="12700"/>
             <wp:docPr id="75877237" name="Picture 75877237"/>
@@ -21213,11 +22261,11 @@
               <a:graphicData uri="http://schemas.openxmlformats.org/drawingml/2006/picture">
                 <pic:pic xmlns:pic="http://schemas.openxmlformats.org/drawingml/2006/picture">
                   <pic:nvPicPr>
-                    <pic:cNvPr id="0" name="Picture 1586417504"/>
+                    <pic:cNvPr id="0" name="Picture 75877237"/>
                     <pic:cNvPicPr/>
                   </pic:nvPicPr>
                   <pic:blipFill>
-                    <a:blip r:embed="rId34" cstate="print">
+                    <a:blip r:embed="rId37" cstate="print">
                       <a:extLst>
                         <a:ext uri="{28A0092B-C50C-407E-A947-70E740481C1C}">
                           <a14:useLocalDpi xmlns:a14="http://schemas.microsoft.com/office/drawing/2010/main" val="0"/>
@@ -21257,7 +22305,7 @@
           <w:sz w:val="20"/>
           <w:lang w:val="en-IN"/>
         </w:rPr>
-        <w:t xml:space="preserve">Fig. </w:t>
+        <w:t>Fig. 1</w:t>
       </w:r>
       <w:r>
         <w:rPr>
@@ -21267,7 +22315,7 @@
           <w:sz w:val="20"/>
           <w:lang w:val="en-IN"/>
         </w:rPr>
-        <w:t>13</w:t>
+        <w:t>6</w:t>
       </w:r>
       <w:r>
         <w:rPr>
@@ -27538,7 +28586,7 @@
           <w:iCs/>
           <w:lang w:val="en-IN"/>
         </w:rPr>
-        <w:t>8</w:t>
+        <w:t>9</w:t>
       </w:r>
       <w:r>
         <w:rPr>
@@ -27595,7 +28643,7 @@
         </w:rPr>
         <w:lastRenderedPageBreak/>
         <w:drawing>
-          <wp:inline distT="0" distB="0" distL="0" distR="0" wp14:anchorId="222050F2" wp14:editId="5EF8F543">
+          <wp:inline distT="0" distB="0" distL="0" distR="0" wp14:anchorId="222050F2" wp14:editId="44287952">
             <wp:extent cx="3114675" cy="2156313"/>
             <wp:effectExtent l="12700" t="12700" r="12700" b="12700"/>
             <wp:docPr id="1637311643" name="Picture 1637311643"/>
@@ -27606,11 +28654,11 @@
               <a:graphicData uri="http://schemas.openxmlformats.org/drawingml/2006/picture">
                 <pic:pic xmlns:pic="http://schemas.openxmlformats.org/drawingml/2006/picture">
                   <pic:nvPicPr>
-                    <pic:cNvPr id="0" name="Picture 2004957282"/>
+                    <pic:cNvPr id="0" name="Picture 1637311643"/>
                     <pic:cNvPicPr/>
                   </pic:nvPicPr>
                   <pic:blipFill>
-                    <a:blip r:embed="rId35" cstate="print">
+                    <a:blip r:embed="rId38" cstate="print">
                       <a:extLst>
                         <a:ext uri="{28A0092B-C50C-407E-A947-70E740481C1C}">
                           <a14:useLocalDpi xmlns:a14="http://schemas.microsoft.com/office/drawing/2010/main" val="0"/>
@@ -27648,7 +28696,7 @@
           <w:iCs/>
           <w:lang w:val="en-IN"/>
         </w:rPr>
-        <w:t xml:space="preserve">Fig. </w:t>
+        <w:t>Fig. 1</w:t>
       </w:r>
       <w:r>
         <w:rPr>
@@ -27656,7 +28704,7 @@
           <w:iCs/>
           <w:lang w:val="en-IN"/>
         </w:rPr>
-        <w:t>14</w:t>
+        <w:t>7</w:t>
       </w:r>
       <w:r>
         <w:rPr>
@@ -27696,84 +28744,76 @@
           <w:noProof/>
           <w:lang w:val="en-IN"/>
         </w:rPr>
-        <w:t>ust</w:t>
+        <w:t>ust like the previous case, both the classifiers did perfect reconstruction with the train data achiving 100% similarity</w:t>
       </w:r>
       <w:r>
         <w:rPr>
           <w:noProof/>
           <w:lang w:val="en-IN"/>
         </w:rPr>
-        <w:t xml:space="preserve"> like the previous case, both the classifiers did perfect reconstruction with the train data</w:t>
+        <w:t>.</w:t>
       </w:r>
       <w:r>
         <w:rPr>
           <w:noProof/>
           <w:lang w:val="en-IN"/>
         </w:rPr>
-        <w:t xml:space="preserve"> </w:t>
+        <w:t xml:space="preserve"> Fig. 1</w:t>
       </w:r>
       <w:r>
         <w:rPr>
           <w:noProof/>
           <w:lang w:val="en-IN"/>
         </w:rPr>
-        <w:t xml:space="preserve">achiving 100% </w:t>
+        <w:t>8</w:t>
       </w:r>
       <w:r>
         <w:rPr>
           <w:noProof/>
           <w:lang w:val="en-IN"/>
         </w:rPr>
-        <w:t>similarity</w:t>
+        <w:t xml:space="preserve"> </w:t>
       </w:r>
       <w:r>
         <w:rPr>
           <w:noProof/>
           <w:lang w:val="en-IN"/>
         </w:rPr>
-        <w:t>.</w:t>
+        <w:t xml:space="preserve">and Fig. 19 </w:t>
       </w:r>
       <w:r>
         <w:rPr>
           <w:noProof/>
           <w:lang w:val="en-IN"/>
         </w:rPr>
-        <w:t xml:space="preserve"> Fig. </w:t>
-      </w:r>
-      <w:r>
+        <w:t>confirms that with red lines matching blue lines.</w:t>
+      </w:r>
+    </w:p>
+    <w:p>
+      <w:pPr>
+        <w:jc w:val="both"/>
         <w:rPr>
           <w:noProof/>
           <w:lang w:val="en-IN"/>
         </w:rPr>
-        <w:t>15</w:t>
-      </w:r>
+      </w:pPr>
+    </w:p>
+    <w:p>
+      <w:pPr>
+        <w:rPr>
+          <w:i/>
+          <w:iCs/>
+        </w:rPr>
+      </w:pPr>
       <w:r>
         <w:rPr>
           <w:noProof/>
-          <w:lang w:val="en-IN"/>
-        </w:rPr>
-        <w:t xml:space="preserve"> confirms that with red lines matching blue lines.</w:t>
-      </w:r>
-    </w:p>
-    <w:p>
-      <w:pPr>
-        <w:jc w:val="both"/>
-        <w:rPr>
-          <w:noProof/>
-          <w:lang w:val="en-IN"/>
-        </w:rPr>
-      </w:pPr>
-    </w:p>
-    <w:p>
-      <w:r>
-        <w:rPr>
-          <w:noProof/>
         </w:rPr>
         <w:drawing>
-          <wp:inline distT="0" distB="0" distL="0" distR="0" wp14:anchorId="185189BE" wp14:editId="6445A5DD">
-            <wp:extent cx="3114675" cy="2156314"/>
-            <wp:effectExtent l="19050" t="19050" r="9525" b="15875"/>
-            <wp:docPr id="478751197" name="Picture 478751197"/>
+          <wp:inline distT="0" distB="0" distL="0" distR="0" wp14:anchorId="1FB51464" wp14:editId="6A68739F">
+            <wp:extent cx="3095625" cy="2143125"/>
+            <wp:effectExtent l="12700" t="12700" r="12700" b="12700"/>
+            <wp:docPr id="308162569" name="Picture 308162569"/>
             <wp:cNvGraphicFramePr>
               <a:graphicFrameLocks xmlns:a="http://schemas.openxmlformats.org/drawingml/2006/main" noChangeAspect="1"/>
             </wp:cNvGraphicFramePr>
@@ -27781,11 +28821,11 @@
               <a:graphicData uri="http://schemas.openxmlformats.org/drawingml/2006/picture">
                 <pic:pic xmlns:pic="http://schemas.openxmlformats.org/drawingml/2006/picture">
                   <pic:nvPicPr>
-                    <pic:cNvPr id="0" name="Picture 847059124"/>
+                    <pic:cNvPr id="0" name=""/>
                     <pic:cNvPicPr/>
                   </pic:nvPicPr>
                   <pic:blipFill>
-                    <a:blip r:embed="rId36" cstate="print">
+                    <a:blip r:embed="rId39" cstate="print">
                       <a:extLst>
                         <a:ext uri="{28A0092B-C50C-407E-A947-70E740481C1C}">
                           <a14:useLocalDpi xmlns:a14="http://schemas.microsoft.com/office/drawing/2010/main" val="0"/>
@@ -27799,7 +28839,7 @@
                   <pic:spPr>
                     <a:xfrm>
                       <a:off x="0" y="0"/>
-                      <a:ext cx="3119818" cy="2159875"/>
+                      <a:ext cx="3095625" cy="2143125"/>
                     </a:xfrm>
                     <a:prstGeom prst="rect">
                       <a:avLst/>
@@ -27822,21 +28862,124 @@
           <w:i/>
           <w:iCs/>
         </w:rPr>
-        <w:t xml:space="preserve">Fig. </w:t>
+        <w:t>Fig. 1</w:t>
       </w:r>
       <w:r>
         <w:rPr>
           <w:i/>
           <w:iCs/>
         </w:rPr>
-        <w:t>15</w:t>
+        <w:t>8</w:t>
       </w:r>
       <w:r>
         <w:rPr>
           <w:i/>
           <w:iCs/>
         </w:rPr>
-        <w:t>: Similarity plot for train data (case 2)</w:t>
+        <w:t xml:space="preserve">: </w:t>
+      </w:r>
+      <w:r>
+        <w:rPr>
+          <w:i/>
+          <w:iCs/>
+        </w:rPr>
+        <w:t xml:space="preserve">Percentage </w:t>
+      </w:r>
+      <w:r>
+        <w:rPr>
+          <w:i/>
+          <w:iCs/>
+        </w:rPr>
+        <w:t>Similarity plot for train data (case 2)</w:t>
+      </w:r>
+    </w:p>
+    <w:p>
+      <w:pPr>
+        <w:rPr>
+          <w:i/>
+          <w:iCs/>
+        </w:rPr>
+      </w:pPr>
+    </w:p>
+    <w:p>
+      <w:pPr>
+        <w:rPr>
+          <w:i/>
+          <w:iCs/>
+        </w:rPr>
+      </w:pPr>
+      <w:r>
+        <w:rPr>
+          <w:noProof/>
+        </w:rPr>
+        <w:drawing>
+          <wp:inline distT="0" distB="0" distL="0" distR="0" wp14:anchorId="6F056A65" wp14:editId="2761B4F9">
+            <wp:extent cx="3095625" cy="2143125"/>
+            <wp:effectExtent l="12700" t="12700" r="12700" b="12700"/>
+            <wp:docPr id="188071530" name="Picture 188071530"/>
+            <wp:cNvGraphicFramePr>
+              <a:graphicFrameLocks xmlns:a="http://schemas.openxmlformats.org/drawingml/2006/main" noChangeAspect="1"/>
+            </wp:cNvGraphicFramePr>
+            <a:graphic xmlns:a="http://schemas.openxmlformats.org/drawingml/2006/main">
+              <a:graphicData uri="http://schemas.openxmlformats.org/drawingml/2006/picture">
+                <pic:pic xmlns:pic="http://schemas.openxmlformats.org/drawingml/2006/picture">
+                  <pic:nvPicPr>
+                    <pic:cNvPr id="0" name=""/>
+                    <pic:cNvPicPr/>
+                  </pic:nvPicPr>
+                  <pic:blipFill>
+                    <a:blip r:embed="rId40" cstate="print">
+                      <a:extLst>
+                        <a:ext uri="{28A0092B-C50C-407E-A947-70E740481C1C}">
+                          <a14:useLocalDpi xmlns:a14="http://schemas.microsoft.com/office/drawing/2010/main" val="0"/>
+                        </a:ext>
+                      </a:extLst>
+                    </a:blip>
+                    <a:stretch>
+                      <a:fillRect/>
+                    </a:stretch>
+                  </pic:blipFill>
+                  <pic:spPr>
+                    <a:xfrm>
+                      <a:off x="0" y="0"/>
+                      <a:ext cx="3095625" cy="2143125"/>
+                    </a:xfrm>
+                    <a:prstGeom prst="rect">
+                      <a:avLst/>
+                    </a:prstGeom>
+                    <a:ln w="12700">
+                      <a:solidFill>
+                        <a:schemeClr val="tx1"/>
+                      </a:solidFill>
+                      <a:prstDash val="solid"/>
+                    </a:ln>
+                  </pic:spPr>
+                </pic:pic>
+              </a:graphicData>
+            </a:graphic>
+          </wp:inline>
+        </w:drawing>
+      </w:r>
+      <w:r>
+        <w:rPr>
+          <w:i/>
+          <w:iCs/>
+        </w:rPr>
+        <w:t>Fig. 1</w:t>
+      </w:r>
+      <w:r>
+        <w:rPr>
+          <w:i/>
+          <w:iCs/>
+        </w:rPr>
+        <w:t>9</w:t>
+      </w:r>
+      <w:r>
+        <w:rPr>
+          <w:i/>
+          <w:iCs/>
+        </w:rPr>
+        <w:t>: Internal Similarity plot for train data (case 2)</w:t>
       </w:r>
     </w:p>
     <w:p>
@@ -27879,7 +29022,14 @@
           <w:spacing w:val="-1"/>
           <w:lang w:val="en-IN"/>
         </w:rPr>
-        <w:t xml:space="preserve">HTM’s temporal coherence and SP-driven SDR stability enabled superior generalization. However, its fixed parameters (e.g., potential radius) limited performance at extremes, suggesting dynamic adjustments could enhance robustness. KNN, while efficient for narrow ranges, faltered in high-dimensional spaces due to static logic and computational inefficiency. </w:t>
+        <w:t xml:space="preserve">HTM’s temporal coherence and SP-driven SDR stability enabled superior generalization. However, its fixed parameters (e.g., potential radius) limited performance at extremes, suggesting dynamic adjustments could enhance </w:t>
+      </w:r>
+      <w:r>
+        <w:rPr>
+          <w:spacing w:val="-1"/>
+          <w:lang w:val="en-IN"/>
+        </w:rPr>
+        <w:t xml:space="preserve">robustness. KNN, while efficient for narrow ranges, faltered in high-dimensional spaces due to static logic and computational inefficiency. </w:t>
       </w:r>
     </w:p>
     <w:p>
@@ -28033,6 +29183,7 @@
           <w:spacing w:val="-1"/>
           <w:lang w:eastAsia="x-none"/>
         </w:rPr>
+        <w:lastRenderedPageBreak/>
         <w:t>Finally, the study underscores HTM’s potential as a bridge between bio-inspired computation and practical machine learning. By addressing adaptive parameterization, noise resilience, and encoder versatility, HTM networks could transcend controlled experiments, advancing applications from adaptive robotics to predictive maintenance. These pathways not only refine HTM’s theoretical framework but also expand its utility in an era increasingly reliant on adaptive, energy-efficient AI systems.</w:t>
       </w:r>
     </w:p>
@@ -28076,11 +29227,7 @@
         <w:jc w:val="both"/>
       </w:pPr>
       <w:r>
-        <w:t xml:space="preserve">This study explored the potential of Hierarchical Temporal Memory (HTM) and K-Nearest Neighbors (KNN) classifiers in reconstructing input values from Sparse Distributed </w:t>
-      </w:r>
-      <w:r>
-        <w:lastRenderedPageBreak/>
-        <w:t>Representations (SDRs). The results indicate that HTM Classifier consistently outperforms KNN Classifier in terms of accuracy, computational efficiency, and generalization ability. By leveraging biologically inspired learning mechanisms, HTM Classifier demonstrated a percentage similarity much better than KNN Classifier, confirming HTM’s superior capability in reconstructing input patterns.</w:t>
+        <w:t>This study explored the potential of Hierarchical Temporal Memory (HTM) and K-Nearest Neighbors (KNN) classifiers in reconstructing input values from Sparse Distributed Representations (SDRs). The results indicate that HTM Classifier consistently outperforms KNN Classifier in terms of accuracy, computational efficiency, and generalization ability. By leveraging biologically inspired learning mechanisms, HTM Classifier demonstrated a percentage similarity much better than KNN Classifier, confirming HTM’s superior capability in reconstructing input patterns.</w:t>
       </w:r>
     </w:p>
     <w:p>
@@ -28187,7 +29334,7 @@
         </w:rPr>
         <w:t xml:space="preserve">, vol. 10, 2016. DOI: </w:t>
       </w:r>
-      <w:hyperlink r:id="rId37">
+      <w:hyperlink r:id="rId41">
         <w:r>
           <w:rPr>
             <w:rStyle w:val="Hyperlink"/>
@@ -28271,7 +29418,7 @@
         </w:rPr>
         <w:t xml:space="preserve">, 2011. [Online]. Available: </w:t>
       </w:r>
-      <w:hyperlink r:id="rId38">
+      <w:hyperlink r:id="rId42">
         <w:r>
           <w:rPr>
             <w:rStyle w:val="Hyperlink"/>
@@ -28380,7 +29527,7 @@
         </w:rPr>
         <w:t xml:space="preserve">DOI: </w:t>
       </w:r>
-      <w:hyperlink r:id="rId39">
+      <w:hyperlink r:id="rId43">
         <w:r>
           <w:rPr>
             <w:rStyle w:val="Hyperlink"/>
@@ -28439,18 +29586,7 @@
           <w:szCs w:val="20"/>
           <w:lang w:val="en-IN"/>
         </w:rPr>
-        <w:t xml:space="preserve">Frontiers in </w:t>
-      </w:r>
-      <w:r>
-        <w:rPr>
-          <w:rFonts w:ascii="Times New Roman" w:eastAsia="Times New Roman" w:hAnsi="Times New Roman"/>
-          <w:i/>
-          <w:iCs/>
-          <w:sz w:val="20"/>
-          <w:szCs w:val="20"/>
-          <w:lang w:val="en-IN"/>
-        </w:rPr>
-        <w:t>Computational Neuroscience</w:t>
+        <w:t>Frontiers in Computational Neuroscience</w:t>
       </w:r>
       <w:r>
         <w:rPr>
@@ -28461,7 +29597,7 @@
         </w:rPr>
         <w:t xml:space="preserve">, vol. 11, 2017. DOI: </w:t>
       </w:r>
-      <w:hyperlink r:id="rId40">
+      <w:hyperlink r:id="rId44">
         <w:r>
           <w:rPr>
             <w:rStyle w:val="Hyperlink"/>
@@ -28576,7 +29712,7 @@
         </w:rPr>
         <w:t xml:space="preserve">. Mak., vol. 16, no. 3, pp. 197–208, 2016. DOI: </w:t>
       </w:r>
-      <w:hyperlink r:id="rId41">
+      <w:hyperlink r:id="rId45">
         <w:r>
           <w:rPr>
             <w:rStyle w:val="Hyperlink"/>
@@ -28616,8 +29752,8 @@
       </w:pPr>
     </w:p>
     <w:sectPr>
-      <w:headerReference w:type="default" r:id="rId42"/>
-      <w:footerReference w:type="default" r:id="rId43"/>
+      <w:headerReference w:type="default" r:id="rId46"/>
+      <w:footerReference w:type="default" r:id="rId47"/>
       <w:type w:val="continuous"/>
       <w:pgSz w:w="11906" w:h="16838" w:code="9"/>
       <w:pgMar w:top="1080" w:right="907" w:bottom="1440" w:left="907" w:header="720" w:footer="720" w:gutter="0"/>

</xml_diff>